<commit_message>
Add hypothesis assignments and update supplementary information
</commit_message>
<xml_diff>
--- a/Supplementary Information.docx
+++ b/Supplementary Information.docx
@@ -251,7 +251,6 @@
           <w:sz w:val="24"/>
           <w:szCs w:val="24"/>
         </w:rPr>
-        <w:lastRenderedPageBreak/>
         <w:t xml:space="preserve">Supplementary Note </w:t>
       </w:r>
       <w:r>
@@ -350,6 +349,7 @@
           <w:sz w:val="22"/>
           <w:lang w:eastAsia="zh-CN"/>
         </w:rPr>
+        <w:lastRenderedPageBreak/>
         <w:t xml:space="preserve">Hypothesis A. If park area, habitat diversity, and distance to the city center are increased, and park isolation, park shape, and environmental noise are decreased, then an increase in bird species richness will be observed. </w:t>
       </w:r>
     </w:p>
@@ -570,7 +570,6 @@
           <w:color w:val="000000" w:themeColor="text1"/>
           <w:sz w:val="30"/>
         </w:rPr>
-        <w:lastRenderedPageBreak/>
         <w:t xml:space="preserve">Supplementary Note </w:t>
       </w:r>
       <w:r>
@@ -756,6 +755,7 @@
                 <w:sz w:val="18"/>
                 <w:lang w:eastAsia="zh-CN"/>
               </w:rPr>
+              <w:lastRenderedPageBreak/>
               <w:t>Expert</w:t>
             </w:r>
             <w:r>
@@ -1303,7 +1303,6 @@
                 <w:rFonts w:ascii="Times New Roman" w:hAnsi="Times New Roman" w:cs="Times New Roman"/>
                 <w:sz w:val="18"/>
               </w:rPr>
-              <w:lastRenderedPageBreak/>
               <w:t>Critic</w:t>
             </w:r>
           </w:p>
@@ -1784,6 +1783,7 @@
           <w:rFonts w:ascii="Times New Roman" w:hAnsi="Times New Roman" w:cs="Times New Roman"/>
           <w:b/>
         </w:rPr>
+        <w:lastRenderedPageBreak/>
         <w:t xml:space="preserve">Supplementary Table </w:t>
       </w:r>
       <w:r>
@@ -2005,7 +2005,6 @@
           <w:rFonts w:ascii="Times New Roman" w:hAnsi="Times New Roman" w:cs="Times New Roman"/>
           <w:b/>
         </w:rPr>
-        <w:lastRenderedPageBreak/>
         <w:t xml:space="preserve">Supplementary Table </w:t>
       </w:r>
       <w:r>
@@ -4127,7 +4126,6 @@
           <w:rFonts w:ascii="Times New Roman" w:hAnsi="Times New Roman" w:cs="Times New Roman"/>
           <w:b/>
         </w:rPr>
-        <w:lastRenderedPageBreak/>
         <w:t xml:space="preserve">Supplementary Table </w:t>
       </w:r>
       <w:r>
@@ -4361,6 +4359,7 @@
                 <w:rFonts w:ascii="Times New Roman" w:eastAsiaTheme="minorEastAsia" w:hAnsi="Times New Roman" w:cs="Times New Roman"/>
                 <w:lang w:eastAsia="zh-CN"/>
               </w:rPr>
+              <w:lastRenderedPageBreak/>
               <w:t>## Knowledge</w:t>
             </w:r>
           </w:p>
@@ -4738,158 +4737,151 @@
                 <w:rFonts w:ascii="Times New Roman" w:eastAsiaTheme="minorEastAsia" w:hAnsi="Times New Roman" w:cs="Times New Roman"/>
                 <w:lang w:eastAsia="zh-CN"/>
               </w:rPr>
-              <w:t xml:space="preserve">7. **When generating hypotheses, focus on major and direct ecological mechanisms rather than long and speculative causal chains. Avoid hypotheses that rely on multiple indirect steps or unlikely intermediary events to link cause and effect. A hypothesis should explain </w:t>
-            </w:r>
+              <w:t>7. **When generating hypotheses, focus on major and direct ecological mechanisms rather than long and speculative causal chains. Avoid hypotheses that rely on multiple indirect steps or unlikely intermediary events to link cause and effect. A hypothesis should explain phenomena using the most direct and primary mechanism, not a complex chain of minor influences**.</w:t>
+            </w:r>
+          </w:p>
+          <w:p>
+            <w:pPr>
+              <w:spacing w:after="0" w:line="240" w:lineRule="auto"/>
+              <w:rPr>
+                <w:rFonts w:ascii="Times New Roman" w:eastAsiaTheme="minorEastAsia" w:hAnsi="Times New Roman" w:cs="Times New Roman"/>
+                <w:lang w:eastAsia="zh-CN"/>
+              </w:rPr>
+            </w:pPr>
+            <w:r>
+              <w:rPr>
+                <w:rFonts w:ascii="Times New Roman" w:eastAsiaTheme="minorEastAsia" w:hAnsi="Times New Roman" w:cs="Times New Roman"/>
+                <w:lang w:eastAsia="zh-CN"/>
+              </w:rPr>
+              <w:t>8. **Ecological significance. The generated hypothesis must address a question of clear and broad importance to ecology or urban biodiversity**. Avoid hypotheses that are merely novel, plausible, or taxon-specific but have limited theoretical, empirical, or applied ecological significance. Hypotheses whose outcomes would not substantially advance ecological understanding or inform biodiversity management should be avoided.</w:t>
+            </w:r>
+          </w:p>
+          <w:p>
+            <w:pPr>
+              <w:spacing w:after="0" w:line="240" w:lineRule="auto"/>
+              <w:rPr>
+                <w:rFonts w:ascii="Times New Roman" w:eastAsiaTheme="minorEastAsia" w:hAnsi="Times New Roman" w:cs="Times New Roman"/>
+                <w:lang w:eastAsia="zh-CN"/>
+              </w:rPr>
+            </w:pPr>
+            <w:r>
+              <w:rPr>
+                <w:rFonts w:ascii="Times New Roman" w:eastAsiaTheme="minorEastAsia" w:hAnsi="Times New Roman" w:cs="Times New Roman"/>
+                <w:lang w:eastAsia="zh-CN"/>
+              </w:rPr>
+              <w:t>9. **Please ensure that each generated hypothesis is specific, clearly identifying the key ecological mechanisms, variables, and contexts involved, rather than remaining abstract or overly general**.</w:t>
+            </w:r>
+          </w:p>
+          <w:p>
+            <w:pPr>
+              <w:spacing w:after="0" w:line="240" w:lineRule="auto"/>
+              <w:rPr>
+                <w:rFonts w:ascii="Times New Roman" w:eastAsiaTheme="minorEastAsia" w:hAnsi="Times New Roman" w:cs="Times New Roman"/>
+                <w:lang w:eastAsia="zh-CN"/>
+              </w:rPr>
+            </w:pPr>
+            <w:r>
+              <w:rPr>
+                <w:rFonts w:ascii="Times New Roman" w:eastAsiaTheme="minorEastAsia" w:hAnsi="Times New Roman" w:cs="Times New Roman"/>
+                <w:lang w:eastAsia="zh-CN"/>
+              </w:rPr>
+              <w:t>10. **High-quality hypotheses do not exceed 50 words**.</w:t>
+            </w:r>
+          </w:p>
+          <w:p>
+            <w:pPr>
+              <w:spacing w:after="0" w:line="240" w:lineRule="auto"/>
+              <w:rPr>
+                <w:rFonts w:ascii="Times New Roman" w:eastAsiaTheme="minorEastAsia" w:hAnsi="Times New Roman" w:cs="Times New Roman"/>
+                <w:lang w:eastAsia="zh-CN"/>
+              </w:rPr>
+            </w:pPr>
+            <w:r>
+              <w:rPr>
+                <w:rFonts w:ascii="Times New Roman" w:eastAsiaTheme="minorEastAsia" w:hAnsi="Times New Roman" w:cs="Times New Roman"/>
+                <w:lang w:eastAsia="zh-CN"/>
+              </w:rPr>
+              <w:t>11. **The hypotheses you generate may be inspired by both the papers you have and the inspiration pool. So please list the sources separately. Note that '</w:t>
+            </w:r>
+            <w:proofErr w:type="spellStart"/>
+            <w:r>
+              <w:rPr>
+                <w:rFonts w:ascii="Times New Roman" w:eastAsiaTheme="minorEastAsia" w:hAnsi="Times New Roman" w:cs="Times New Roman"/>
+                <w:lang w:eastAsia="zh-CN"/>
+              </w:rPr>
+              <w:t>Source_from_Papers</w:t>
+            </w:r>
+            <w:proofErr w:type="spellEnd"/>
+            <w:r>
+              <w:rPr>
+                <w:rFonts w:ascii="Times New Roman" w:eastAsiaTheme="minorEastAsia" w:hAnsi="Times New Roman" w:cs="Times New Roman"/>
+                <w:lang w:eastAsia="zh-CN"/>
+              </w:rPr>
+              <w:t xml:space="preserve"> should' not only list the papers that generated the hypotheses, but also the source papers of inspirations in '</w:t>
+            </w:r>
+            <w:proofErr w:type="spellStart"/>
+            <w:r>
+              <w:rPr>
+                <w:rFonts w:ascii="Times New Roman" w:eastAsiaTheme="minorEastAsia" w:hAnsi="Times New Roman" w:cs="Times New Roman"/>
+                <w:lang w:eastAsia="zh-CN"/>
+              </w:rPr>
+              <w:t>Source_from_InspirationPool</w:t>
+            </w:r>
+            <w:proofErr w:type="spellEnd"/>
+            <w:r>
+              <w:rPr>
+                <w:rFonts w:ascii="Times New Roman" w:eastAsiaTheme="minorEastAsia" w:hAnsi="Times New Roman" w:cs="Times New Roman"/>
+                <w:lang w:eastAsia="zh-CN"/>
+              </w:rPr>
+              <w:t>'**.</w:t>
+            </w:r>
+          </w:p>
+          <w:p>
+            <w:pPr>
+              <w:spacing w:after="0" w:line="240" w:lineRule="auto"/>
+              <w:rPr>
+                <w:rFonts w:ascii="Times New Roman" w:eastAsiaTheme="minorEastAsia" w:hAnsi="Times New Roman" w:cs="Times New Roman"/>
+                <w:lang w:eastAsia="zh-CN"/>
+              </w:rPr>
+            </w:pPr>
+            <w:r>
+              <w:rPr>
+                <w:rFonts w:ascii="Times New Roman" w:eastAsiaTheme="minorEastAsia" w:hAnsi="Times New Roman" w:cs="Times New Roman"/>
+                <w:lang w:eastAsia="zh-CN"/>
+              </w:rPr>
+              <w:t xml:space="preserve">   </w:t>
+            </w:r>
+          </w:p>
+          <w:p>
+            <w:pPr>
+              <w:spacing w:after="0" w:line="240" w:lineRule="auto"/>
+              <w:rPr>
+                <w:rFonts w:ascii="Times New Roman" w:eastAsiaTheme="minorEastAsia" w:hAnsi="Times New Roman" w:cs="Times New Roman"/>
+                <w:lang w:eastAsia="zh-CN"/>
+              </w:rPr>
+            </w:pPr>
+            <w:r>
+              <w:rPr>
+                <w:rFonts w:ascii="Times New Roman" w:eastAsiaTheme="minorEastAsia" w:hAnsi="Times New Roman" w:cs="Times New Roman"/>
+                <w:lang w:eastAsia="zh-CN"/>
+              </w:rPr>
+              <w:t>### Hypothesis Format</w:t>
+            </w:r>
+          </w:p>
+          <w:p>
+            <w:pPr>
+              <w:spacing w:after="0" w:line="240" w:lineRule="auto"/>
+              <w:rPr>
+                <w:rFonts w:ascii="Times New Roman" w:eastAsiaTheme="minorEastAsia" w:hAnsi="Times New Roman" w:cs="Times New Roman"/>
+                <w:lang w:eastAsia="zh-CN"/>
+              </w:rPr>
+            </w:pPr>
             <w:r>
               <w:rPr>
                 <w:rFonts w:ascii="Times New Roman" w:eastAsiaTheme="minorEastAsia" w:hAnsi="Times New Roman" w:cs="Times New Roman"/>
                 <w:lang w:eastAsia="zh-CN"/>
               </w:rPr>
               <w:lastRenderedPageBreak/>
-              <w:t>phenomena using the most direct and primary mechanism, not a complex chain of minor influences**.</w:t>
-            </w:r>
-          </w:p>
-          <w:p>
-            <w:pPr>
-              <w:spacing w:after="0" w:line="240" w:lineRule="auto"/>
-              <w:rPr>
-                <w:rFonts w:ascii="Times New Roman" w:eastAsiaTheme="minorEastAsia" w:hAnsi="Times New Roman" w:cs="Times New Roman"/>
-                <w:lang w:eastAsia="zh-CN"/>
-              </w:rPr>
-            </w:pPr>
-            <w:r>
-              <w:rPr>
-                <w:rFonts w:ascii="Times New Roman" w:eastAsiaTheme="minorEastAsia" w:hAnsi="Times New Roman" w:cs="Times New Roman"/>
-                <w:lang w:eastAsia="zh-CN"/>
-              </w:rPr>
-              <w:t>8. **Ecological significance. The generated hypothesis must address a question of clear and broad importance to ecology or urban biodiversity**. Avoid hypotheses that are merely novel, plausible, or taxon-specific but have limited theoretical, empirical, or applied ecological significance. Hypotheses whose outcomes would not substantially advance ecological understanding or inform biodiversity management should be avoided.</w:t>
-            </w:r>
-          </w:p>
-          <w:p>
-            <w:pPr>
-              <w:spacing w:after="0" w:line="240" w:lineRule="auto"/>
-              <w:rPr>
-                <w:rFonts w:ascii="Times New Roman" w:eastAsiaTheme="minorEastAsia" w:hAnsi="Times New Roman" w:cs="Times New Roman"/>
-                <w:lang w:eastAsia="zh-CN"/>
-              </w:rPr>
-            </w:pPr>
-            <w:r>
-              <w:rPr>
-                <w:rFonts w:ascii="Times New Roman" w:eastAsiaTheme="minorEastAsia" w:hAnsi="Times New Roman" w:cs="Times New Roman"/>
-                <w:lang w:eastAsia="zh-CN"/>
-              </w:rPr>
-              <w:t>9. **Please ensure that each generated hypothesis is specific, clearly identifying the key ecological mechanisms, variables, and contexts involved, rather than remaining abstract or overly general**.</w:t>
-            </w:r>
-          </w:p>
-          <w:p>
-            <w:pPr>
-              <w:spacing w:after="0" w:line="240" w:lineRule="auto"/>
-              <w:rPr>
-                <w:rFonts w:ascii="Times New Roman" w:eastAsiaTheme="minorEastAsia" w:hAnsi="Times New Roman" w:cs="Times New Roman"/>
-                <w:lang w:eastAsia="zh-CN"/>
-              </w:rPr>
-            </w:pPr>
-            <w:r>
-              <w:rPr>
-                <w:rFonts w:ascii="Times New Roman" w:eastAsiaTheme="minorEastAsia" w:hAnsi="Times New Roman" w:cs="Times New Roman"/>
-                <w:lang w:eastAsia="zh-CN"/>
-              </w:rPr>
-              <w:t>10. **High-quality hypotheses do not exceed 50 words**.</w:t>
-            </w:r>
-          </w:p>
-          <w:p>
-            <w:pPr>
-              <w:spacing w:after="0" w:line="240" w:lineRule="auto"/>
-              <w:rPr>
-                <w:rFonts w:ascii="Times New Roman" w:eastAsiaTheme="minorEastAsia" w:hAnsi="Times New Roman" w:cs="Times New Roman"/>
-                <w:lang w:eastAsia="zh-CN"/>
-              </w:rPr>
-            </w:pPr>
-            <w:r>
-              <w:rPr>
-                <w:rFonts w:ascii="Times New Roman" w:eastAsiaTheme="minorEastAsia" w:hAnsi="Times New Roman" w:cs="Times New Roman"/>
-                <w:lang w:eastAsia="zh-CN"/>
-              </w:rPr>
-              <w:t>11. **The hypotheses you generate may be inspired by both the papers you have and the inspiration pool. So please list the sources separately. Note that '</w:t>
-            </w:r>
-            <w:proofErr w:type="spellStart"/>
-            <w:r>
-              <w:rPr>
-                <w:rFonts w:ascii="Times New Roman" w:eastAsiaTheme="minorEastAsia" w:hAnsi="Times New Roman" w:cs="Times New Roman"/>
-                <w:lang w:eastAsia="zh-CN"/>
-              </w:rPr>
-              <w:t>Source_from_Papers</w:t>
-            </w:r>
-            <w:proofErr w:type="spellEnd"/>
-            <w:r>
-              <w:rPr>
-                <w:rFonts w:ascii="Times New Roman" w:eastAsiaTheme="minorEastAsia" w:hAnsi="Times New Roman" w:cs="Times New Roman"/>
-                <w:lang w:eastAsia="zh-CN"/>
-              </w:rPr>
-              <w:t xml:space="preserve"> should' not only list the papers that generated the hypotheses, but also the source papers of inspirations in '</w:t>
-            </w:r>
-            <w:proofErr w:type="spellStart"/>
-            <w:r>
-              <w:rPr>
-                <w:rFonts w:ascii="Times New Roman" w:eastAsiaTheme="minorEastAsia" w:hAnsi="Times New Roman" w:cs="Times New Roman"/>
-                <w:lang w:eastAsia="zh-CN"/>
-              </w:rPr>
-              <w:t>Source_from_InspirationPool</w:t>
-            </w:r>
-            <w:proofErr w:type="spellEnd"/>
-            <w:r>
-              <w:rPr>
-                <w:rFonts w:ascii="Times New Roman" w:eastAsiaTheme="minorEastAsia" w:hAnsi="Times New Roman" w:cs="Times New Roman"/>
-                <w:lang w:eastAsia="zh-CN"/>
-              </w:rPr>
-              <w:t>'**.</w:t>
-            </w:r>
-          </w:p>
-          <w:p>
-            <w:pPr>
-              <w:spacing w:after="0" w:line="240" w:lineRule="auto"/>
-              <w:rPr>
-                <w:rFonts w:ascii="Times New Roman" w:eastAsiaTheme="minorEastAsia" w:hAnsi="Times New Roman" w:cs="Times New Roman"/>
-                <w:lang w:eastAsia="zh-CN"/>
-              </w:rPr>
-            </w:pPr>
-            <w:r>
-              <w:rPr>
-                <w:rFonts w:ascii="Times New Roman" w:eastAsiaTheme="minorEastAsia" w:hAnsi="Times New Roman" w:cs="Times New Roman"/>
-                <w:lang w:eastAsia="zh-CN"/>
-              </w:rPr>
-              <w:t xml:space="preserve">   </w:t>
-            </w:r>
-          </w:p>
-          <w:p>
-            <w:pPr>
-              <w:spacing w:after="0" w:line="240" w:lineRule="auto"/>
-              <w:rPr>
-                <w:rFonts w:ascii="Times New Roman" w:eastAsiaTheme="minorEastAsia" w:hAnsi="Times New Roman" w:cs="Times New Roman"/>
-                <w:lang w:eastAsia="zh-CN"/>
-              </w:rPr>
-            </w:pPr>
-            <w:r>
-              <w:rPr>
-                <w:rFonts w:ascii="Times New Roman" w:eastAsiaTheme="minorEastAsia" w:hAnsi="Times New Roman" w:cs="Times New Roman"/>
-                <w:lang w:eastAsia="zh-CN"/>
-              </w:rPr>
-              <w:t>### Hypothesis Format</w:t>
-            </w:r>
-          </w:p>
-          <w:p>
-            <w:pPr>
-              <w:spacing w:after="0" w:line="240" w:lineRule="auto"/>
-              <w:rPr>
-                <w:rFonts w:ascii="Times New Roman" w:eastAsiaTheme="minorEastAsia" w:hAnsi="Times New Roman" w:cs="Times New Roman"/>
-                <w:lang w:eastAsia="zh-CN"/>
-              </w:rPr>
-            </w:pPr>
-            <w:r>
-              <w:rPr>
-                <w:rFonts w:ascii="Times New Roman" w:eastAsiaTheme="minorEastAsia" w:hAnsi="Times New Roman" w:cs="Times New Roman"/>
-                <w:lang w:eastAsia="zh-CN"/>
-              </w:rPr>
               <w:t>The format of the hypothesis must be:</w:t>
             </w:r>
           </w:p>
@@ -5944,7 +5936,6 @@
           <w:rFonts w:ascii="Times New Roman" w:hAnsi="Times New Roman" w:cs="Times New Roman"/>
           <w:b/>
         </w:rPr>
-        <w:lastRenderedPageBreak/>
         <w:t xml:space="preserve">Supplementary Table </w:t>
       </w:r>
       <w:r>
@@ -6194,6 +6185,7 @@
                 <w:rFonts w:ascii="Times New Roman" w:eastAsiaTheme="minorEastAsia" w:hAnsi="Times New Roman" w:cs="Times New Roman"/>
                 <w:lang w:eastAsia="zh-CN"/>
               </w:rPr>
+              <w:lastRenderedPageBreak/>
               <w:t>{</w:t>
             </w:r>
             <w:proofErr w:type="spellStart"/>
@@ -6603,7 +6595,6 @@
           <w:rFonts w:ascii="Times New Roman" w:hAnsi="Times New Roman" w:cs="Times New Roman"/>
           <w:b/>
         </w:rPr>
-        <w:lastRenderedPageBreak/>
         <w:t xml:space="preserve">Supplementary Table </w:t>
       </w:r>
       <w:r>
@@ -7056,6 +7047,7 @@
                 <w:rFonts w:ascii="Times New Roman" w:eastAsiaTheme="minorEastAsia" w:hAnsi="Times New Roman" w:cs="Times New Roman"/>
                 <w:lang w:eastAsia="zh-CN"/>
               </w:rPr>
+              <w:lastRenderedPageBreak/>
               <w:t>### Retrieved literature library related to the hypothesis:</w:t>
             </w:r>
           </w:p>
@@ -7394,15 +7386,7 @@
                 <w:rFonts w:ascii="Times New Roman" w:eastAsiaTheme="minorEastAsia" w:hAnsi="Times New Roman" w:cs="Times New Roman"/>
                 <w:lang w:eastAsia="zh-CN"/>
               </w:rPr>
-              <w:t xml:space="preserve">**2. SUPPLEMENT**: Supplement an existing inspiration in current inspiration pool to enhance its validity by adding a crucial detail, a supporting piece of evidence, or a new </w:t>
-            </w:r>
-            <w:r>
-              <w:rPr>
-                <w:rFonts w:ascii="Times New Roman" w:eastAsiaTheme="minorEastAsia" w:hAnsi="Times New Roman" w:cs="Times New Roman"/>
-                <w:lang w:eastAsia="zh-CN"/>
-              </w:rPr>
-              <w:lastRenderedPageBreak/>
-              <w:t>perspective. Identify which inspiration you are addressing and strengthen it based on your knowledge and papers.</w:t>
+              <w:t>**2. SUPPLEMENT**: Supplement an existing inspiration in current inspiration pool to enhance its validity by adding a crucial detail, a supporting piece of evidence, or a new perspective. Identify which inspiration you are addressing and strengthen it based on your knowledge and papers.</w:t>
             </w:r>
           </w:p>
           <w:p>
@@ -8008,580 +7992,580 @@
                 <w:rFonts w:ascii="Times New Roman" w:eastAsiaTheme="minorEastAsia" w:hAnsi="Times New Roman" w:cs="Times New Roman"/>
                 <w:lang w:eastAsia="zh-CN"/>
               </w:rPr>
+              <w:t>{</w:t>
+            </w:r>
+            <w:proofErr w:type="spellStart"/>
+            <w:r>
+              <w:rPr>
+                <w:rFonts w:ascii="Times New Roman" w:eastAsiaTheme="minorEastAsia" w:hAnsi="Times New Roman" w:cs="Times New Roman"/>
+                <w:lang w:eastAsia="zh-CN"/>
+              </w:rPr>
+              <w:t>current_hypothesis</w:t>
+            </w:r>
+            <w:proofErr w:type="spellEnd"/>
+            <w:r>
+              <w:rPr>
+                <w:rFonts w:ascii="Times New Roman" w:eastAsiaTheme="minorEastAsia" w:hAnsi="Times New Roman" w:cs="Times New Roman"/>
+                <w:lang w:eastAsia="zh-CN"/>
+              </w:rPr>
+              <w:t>}</w:t>
+            </w:r>
+          </w:p>
+          <w:p>
+            <w:pPr>
+              <w:spacing w:after="0" w:line="240" w:lineRule="auto"/>
+              <w:rPr>
+                <w:rFonts w:ascii="Times New Roman" w:eastAsiaTheme="minorEastAsia" w:hAnsi="Times New Roman" w:cs="Times New Roman"/>
+                <w:lang w:eastAsia="zh-CN"/>
+              </w:rPr>
+            </w:pPr>
+            <w:r>
+              <w:rPr>
+                <w:rFonts w:ascii="Times New Roman" w:eastAsiaTheme="minorEastAsia" w:hAnsi="Times New Roman" w:cs="Times New Roman"/>
+                <w:lang w:eastAsia="zh-CN"/>
+              </w:rPr>
+              <w:t xml:space="preserve">### Inspiration Pool of the Curated </w:t>
+            </w:r>
+            <w:proofErr w:type="spellStart"/>
+            <w:r>
+              <w:rPr>
+                <w:rFonts w:ascii="Times New Roman" w:eastAsiaTheme="minorEastAsia" w:hAnsi="Times New Roman" w:cs="Times New Roman"/>
+                <w:lang w:eastAsia="zh-CN"/>
+              </w:rPr>
+              <w:t>literature_library</w:t>
+            </w:r>
+            <w:proofErr w:type="spellEnd"/>
+          </w:p>
+          <w:p>
+            <w:pPr>
+              <w:spacing w:after="0" w:line="240" w:lineRule="auto"/>
+              <w:rPr>
+                <w:rFonts w:ascii="Times New Roman" w:eastAsiaTheme="minorEastAsia" w:hAnsi="Times New Roman" w:cs="Times New Roman"/>
+                <w:lang w:eastAsia="zh-CN"/>
+              </w:rPr>
+            </w:pPr>
+            <w:r>
+              <w:rPr>
+                <w:rFonts w:ascii="Times New Roman" w:eastAsiaTheme="minorEastAsia" w:hAnsi="Times New Roman" w:cs="Times New Roman"/>
+                <w:lang w:eastAsia="zh-CN"/>
+              </w:rPr>
+              <w:t>{</w:t>
+            </w:r>
+            <w:proofErr w:type="spellStart"/>
+            <w:r>
+              <w:rPr>
+                <w:rFonts w:ascii="Times New Roman" w:eastAsiaTheme="minorEastAsia" w:hAnsi="Times New Roman" w:cs="Times New Roman"/>
+                <w:lang w:eastAsia="zh-CN"/>
+              </w:rPr>
+              <w:t>curated_literature_library_inspiration_pool</w:t>
+            </w:r>
+            <w:proofErr w:type="spellEnd"/>
+            <w:r>
+              <w:rPr>
+                <w:rFonts w:ascii="Times New Roman" w:eastAsiaTheme="minorEastAsia" w:hAnsi="Times New Roman" w:cs="Times New Roman"/>
+                <w:lang w:eastAsia="zh-CN"/>
+              </w:rPr>
+              <w:t xml:space="preserve">} </w:t>
+            </w:r>
+          </w:p>
+          <w:p>
+            <w:pPr>
+              <w:spacing w:after="0" w:line="240" w:lineRule="auto"/>
+              <w:rPr>
+                <w:rFonts w:ascii="Times New Roman" w:eastAsiaTheme="minorEastAsia" w:hAnsi="Times New Roman" w:cs="Times New Roman"/>
+                <w:lang w:eastAsia="zh-CN"/>
+              </w:rPr>
+            </w:pPr>
+            <w:r>
+              <w:rPr>
+                <w:rFonts w:ascii="Times New Roman" w:eastAsiaTheme="minorEastAsia" w:hAnsi="Times New Roman" w:cs="Times New Roman"/>
+                <w:lang w:eastAsia="zh-CN"/>
+              </w:rPr>
+              <w:t>### Retrieved literature library related to the hypothesis:</w:t>
+            </w:r>
+          </w:p>
+          <w:p>
+            <w:pPr>
+              <w:spacing w:after="0" w:line="240" w:lineRule="auto"/>
+              <w:rPr>
+                <w:rFonts w:ascii="Times New Roman" w:eastAsiaTheme="minorEastAsia" w:hAnsi="Times New Roman" w:cs="Times New Roman"/>
+                <w:lang w:eastAsia="zh-CN"/>
+              </w:rPr>
+            </w:pPr>
+            <w:r>
+              <w:rPr>
+                <w:rFonts w:ascii="Times New Roman" w:eastAsiaTheme="minorEastAsia" w:hAnsi="Times New Roman" w:cs="Times New Roman"/>
+                <w:lang w:eastAsia="zh-CN"/>
+              </w:rPr>
+              <w:t>**The papers are organized in the form of chains of papers, from early to late**</w:t>
+            </w:r>
+          </w:p>
+          <w:p>
+            <w:pPr>
+              <w:spacing w:after="0" w:line="240" w:lineRule="auto"/>
+              <w:rPr>
+                <w:rFonts w:ascii="Times New Roman" w:eastAsiaTheme="minorEastAsia" w:hAnsi="Times New Roman" w:cs="Times New Roman"/>
+                <w:lang w:eastAsia="zh-CN"/>
+              </w:rPr>
+            </w:pPr>
+            <w:r>
+              <w:rPr>
+                <w:rFonts w:ascii="Times New Roman" w:eastAsiaTheme="minorEastAsia" w:hAnsi="Times New Roman" w:cs="Times New Roman"/>
+                <w:lang w:eastAsia="zh-CN"/>
+              </w:rPr>
+              <w:t>{</w:t>
+            </w:r>
+            <w:proofErr w:type="spellStart"/>
+            <w:r>
+              <w:rPr>
+                <w:rFonts w:ascii="Times New Roman" w:eastAsiaTheme="minorEastAsia" w:hAnsi="Times New Roman" w:cs="Times New Roman"/>
+                <w:lang w:eastAsia="zh-CN"/>
+              </w:rPr>
+              <w:t>retrieved_literature_library</w:t>
+            </w:r>
+            <w:proofErr w:type="spellEnd"/>
+            <w:r>
+              <w:rPr>
+                <w:rFonts w:ascii="Times New Roman" w:eastAsiaTheme="minorEastAsia" w:hAnsi="Times New Roman" w:cs="Times New Roman"/>
+                <w:lang w:eastAsia="zh-CN"/>
+              </w:rPr>
+              <w:t>}</w:t>
+            </w:r>
+          </w:p>
+          <w:p>
+            <w:pPr>
+              <w:spacing w:after="0" w:line="240" w:lineRule="auto"/>
+              <w:rPr>
+                <w:rFonts w:ascii="Times New Roman" w:eastAsiaTheme="minorEastAsia" w:hAnsi="Times New Roman" w:cs="Times New Roman"/>
+                <w:lang w:eastAsia="zh-CN"/>
+              </w:rPr>
+            </w:pPr>
+            <w:r>
+              <w:rPr>
+                <w:rFonts w:ascii="Times New Roman" w:eastAsiaTheme="minorEastAsia" w:hAnsi="Times New Roman" w:cs="Times New Roman"/>
+                <w:lang w:eastAsia="zh-CN"/>
+              </w:rPr>
+              <w:t>### Discussions so far:</w:t>
+            </w:r>
+          </w:p>
+          <w:p>
+            <w:pPr>
+              <w:spacing w:after="0" w:line="240" w:lineRule="auto"/>
+              <w:rPr>
+                <w:rFonts w:ascii="Times New Roman" w:eastAsiaTheme="minorEastAsia" w:hAnsi="Times New Roman" w:cs="Times New Roman"/>
+                <w:lang w:eastAsia="zh-CN"/>
+              </w:rPr>
+            </w:pPr>
+            <w:r>
+              <w:rPr>
+                <w:rFonts w:ascii="Times New Roman" w:eastAsiaTheme="minorEastAsia" w:hAnsi="Times New Roman" w:cs="Times New Roman"/>
+                <w:lang w:eastAsia="zh-CN"/>
+              </w:rPr>
+              <w:t>{</w:t>
+            </w:r>
+            <w:proofErr w:type="spellStart"/>
+            <w:r>
+              <w:rPr>
+                <w:rFonts w:ascii="Times New Roman" w:eastAsiaTheme="minorEastAsia" w:hAnsi="Times New Roman" w:cs="Times New Roman"/>
+                <w:lang w:eastAsia="zh-CN"/>
+              </w:rPr>
+              <w:t>discussion_history</w:t>
+            </w:r>
+            <w:proofErr w:type="spellEnd"/>
+            <w:r>
+              <w:rPr>
+                <w:rFonts w:ascii="Times New Roman" w:eastAsiaTheme="minorEastAsia" w:hAnsi="Times New Roman" w:cs="Times New Roman"/>
+                <w:lang w:eastAsia="zh-CN"/>
+              </w:rPr>
+              <w:t>}</w:t>
+            </w:r>
+          </w:p>
+          <w:p>
+            <w:pPr>
+              <w:spacing w:after="0" w:line="240" w:lineRule="auto"/>
+              <w:rPr>
+                <w:rFonts w:ascii="Times New Roman" w:eastAsiaTheme="minorEastAsia" w:hAnsi="Times New Roman" w:cs="Times New Roman"/>
+                <w:lang w:eastAsia="zh-CN"/>
+              </w:rPr>
+            </w:pPr>
+            <w:r>
+              <w:rPr>
+                <w:rFonts w:ascii="Times New Roman" w:eastAsiaTheme="minorEastAsia" w:hAnsi="Times New Roman" w:cs="Times New Roman"/>
+                <w:lang w:eastAsia="zh-CN"/>
+              </w:rPr>
+              <w:t>------------------ END OF KNOWLEDGE ------------------</w:t>
+            </w:r>
+          </w:p>
+          <w:p>
+            <w:pPr>
+              <w:spacing w:after="0" w:line="240" w:lineRule="auto"/>
+              <w:rPr>
+                <w:rFonts w:ascii="Times New Roman" w:eastAsiaTheme="minorEastAsia" w:hAnsi="Times New Roman" w:cs="Times New Roman"/>
+                <w:lang w:eastAsia="zh-CN"/>
+              </w:rPr>
+            </w:pPr>
+          </w:p>
+          <w:p>
+            <w:pPr>
+              <w:spacing w:after="0" w:line="240" w:lineRule="auto"/>
+              <w:rPr>
+                <w:rFonts w:ascii="Times New Roman" w:eastAsiaTheme="minorEastAsia" w:hAnsi="Times New Roman" w:cs="Times New Roman"/>
+                <w:lang w:eastAsia="zh-CN"/>
+              </w:rPr>
+            </w:pPr>
+            <w:r>
+              <w:rPr>
+                <w:rFonts w:ascii="Times New Roman" w:eastAsiaTheme="minorEastAsia" w:hAnsi="Times New Roman" w:cs="Times New Roman"/>
+                <w:lang w:eastAsia="zh-CN"/>
+              </w:rPr>
+              <w:t>------------------ BEGIN OF DETAILED INSTRUCTIONS ------------------</w:t>
+            </w:r>
+          </w:p>
+          <w:p>
+            <w:pPr>
+              <w:spacing w:after="0" w:line="240" w:lineRule="auto"/>
+              <w:rPr>
+                <w:rFonts w:ascii="Times New Roman" w:eastAsiaTheme="minorEastAsia" w:hAnsi="Times New Roman" w:cs="Times New Roman"/>
+                <w:lang w:eastAsia="zh-CN"/>
+              </w:rPr>
+            </w:pPr>
+            <w:r>
+              <w:rPr>
+                <w:rFonts w:ascii="Times New Roman" w:eastAsiaTheme="minorEastAsia" w:hAnsi="Times New Roman" w:cs="Times New Roman"/>
+                <w:lang w:eastAsia="zh-CN"/>
+              </w:rPr>
+              <w:t>## Detailed Instructions</w:t>
+            </w:r>
+          </w:p>
+          <w:p>
+            <w:pPr>
+              <w:spacing w:after="0" w:line="240" w:lineRule="auto"/>
+              <w:rPr>
+                <w:rFonts w:ascii="Times New Roman" w:eastAsiaTheme="minorEastAsia" w:hAnsi="Times New Roman" w:cs="Times New Roman"/>
+                <w:lang w:eastAsia="zh-CN"/>
+              </w:rPr>
+            </w:pPr>
+            <w:r>
+              <w:rPr>
+                <w:rFonts w:ascii="Times New Roman" w:eastAsiaTheme="minorEastAsia" w:hAnsi="Times New Roman" w:cs="Times New Roman"/>
+                <w:lang w:eastAsia="zh-CN"/>
+              </w:rPr>
+              <w:t>**Now, based on the Task and the Knowledge above, follow these instructions precisely**.</w:t>
+            </w:r>
+          </w:p>
+          <w:p>
+            <w:pPr>
+              <w:spacing w:after="0" w:line="240" w:lineRule="auto"/>
+              <w:rPr>
+                <w:rFonts w:ascii="Times New Roman" w:eastAsiaTheme="minorEastAsia" w:hAnsi="Times New Roman" w:cs="Times New Roman"/>
+                <w:lang w:eastAsia="zh-CN"/>
+              </w:rPr>
+            </w:pPr>
+          </w:p>
+          <w:p>
+            <w:pPr>
+              <w:spacing w:after="0" w:line="240" w:lineRule="auto"/>
+              <w:rPr>
+                <w:rFonts w:ascii="Times New Roman" w:eastAsiaTheme="minorEastAsia" w:hAnsi="Times New Roman" w:cs="Times New Roman"/>
+                <w:lang w:eastAsia="zh-CN"/>
+              </w:rPr>
+            </w:pPr>
+            <w:r>
+              <w:rPr>
+                <w:rFonts w:ascii="Times New Roman" w:eastAsiaTheme="minorEastAsia" w:hAnsi="Times New Roman" w:cs="Times New Roman"/>
+                <w:lang w:eastAsia="zh-CN"/>
+              </w:rPr>
+              <w:t>### Method</w:t>
+            </w:r>
+          </w:p>
+          <w:p>
+            <w:pPr>
+              <w:spacing w:after="0" w:line="240" w:lineRule="auto"/>
+              <w:rPr>
+                <w:rFonts w:ascii="Times New Roman" w:eastAsiaTheme="minorEastAsia" w:hAnsi="Times New Roman" w:cs="Times New Roman"/>
+                <w:lang w:eastAsia="zh-CN"/>
+              </w:rPr>
+            </w:pPr>
+            <w:r>
+              <w:rPr>
+                <w:rFonts w:ascii="Times New Roman" w:eastAsiaTheme="minorEastAsia" w:hAnsi="Times New Roman" w:cs="Times New Roman"/>
+                <w:lang w:eastAsia="zh-CN"/>
+              </w:rPr>
+              <w:t>Step 1: Analytical Summary</w:t>
+            </w:r>
+          </w:p>
+          <w:p>
+            <w:pPr>
+              <w:spacing w:after="0" w:line="240" w:lineRule="auto"/>
+              <w:rPr>
+                <w:rFonts w:ascii="Times New Roman" w:eastAsiaTheme="minorEastAsia" w:hAnsi="Times New Roman" w:cs="Times New Roman"/>
+                <w:lang w:eastAsia="zh-CN"/>
+              </w:rPr>
+            </w:pPr>
+            <w:r>
+              <w:rPr>
+                <w:rFonts w:ascii="Times New Roman" w:eastAsiaTheme="minorEastAsia" w:hAnsi="Times New Roman" w:cs="Times New Roman"/>
+                <w:lang w:eastAsia="zh-CN"/>
+              </w:rPr>
+              <w:t>First, critically analyze the current state of the discussion and the inspirations generated. You must answer these questions:</w:t>
+            </w:r>
+          </w:p>
+          <w:p>
+            <w:pPr>
+              <w:spacing w:after="0" w:line="240" w:lineRule="auto"/>
+              <w:rPr>
+                <w:rFonts w:ascii="Times New Roman" w:eastAsiaTheme="minorEastAsia" w:hAnsi="Times New Roman" w:cs="Times New Roman"/>
+                <w:lang w:eastAsia="zh-CN"/>
+              </w:rPr>
+            </w:pPr>
+            <w:r>
+              <w:rPr>
+                <w:rFonts w:ascii="Times New Roman" w:eastAsiaTheme="minorEastAsia" w:hAnsi="Times New Roman" w:cs="Times New Roman"/>
+                <w:lang w:eastAsia="zh-CN"/>
+              </w:rPr>
+              <w:t xml:space="preserve">1. **What is the overall quality, importance and novelty of the inspirations so </w:t>
+            </w:r>
+            <w:proofErr w:type="gramStart"/>
+            <w:r>
+              <w:rPr>
+                <w:rFonts w:ascii="Times New Roman" w:eastAsiaTheme="minorEastAsia" w:hAnsi="Times New Roman" w:cs="Times New Roman"/>
+                <w:lang w:eastAsia="zh-CN"/>
+              </w:rPr>
+              <w:t>far?*</w:t>
+            </w:r>
+            <w:proofErr w:type="gramEnd"/>
+            <w:r>
+              <w:rPr>
+                <w:rFonts w:ascii="Times New Roman" w:eastAsiaTheme="minorEastAsia" w:hAnsi="Times New Roman" w:cs="Times New Roman"/>
+                <w:lang w:eastAsia="zh-CN"/>
+              </w:rPr>
+              <w:t>*</w:t>
+            </w:r>
+          </w:p>
+          <w:p>
+            <w:pPr>
+              <w:spacing w:after="0" w:line="240" w:lineRule="auto"/>
+              <w:rPr>
+                <w:rFonts w:ascii="Times New Roman" w:eastAsiaTheme="minorEastAsia" w:hAnsi="Times New Roman" w:cs="Times New Roman"/>
+                <w:lang w:eastAsia="zh-CN"/>
+              </w:rPr>
+            </w:pPr>
+            <w:r>
+              <w:rPr>
+                <w:rFonts w:ascii="Times New Roman" w:eastAsiaTheme="minorEastAsia" w:hAnsi="Times New Roman" w:cs="Times New Roman"/>
+                <w:lang w:eastAsia="zh-CN"/>
+              </w:rPr>
+              <w:t>-To what extent do the generated hypotheses demonstrate genuine novelty compared to existing urban biodiversity literature?</w:t>
+            </w:r>
+          </w:p>
+          <w:p>
+            <w:pPr>
+              <w:spacing w:after="0" w:line="240" w:lineRule="auto"/>
+              <w:rPr>
+                <w:rFonts w:ascii="Times New Roman" w:eastAsiaTheme="minorEastAsia" w:hAnsi="Times New Roman" w:cs="Times New Roman"/>
+                <w:lang w:eastAsia="zh-CN"/>
+              </w:rPr>
+            </w:pPr>
+            <w:r>
+              <w:rPr>
+                <w:rFonts w:ascii="Times New Roman" w:eastAsiaTheme="minorEastAsia" w:hAnsi="Times New Roman" w:cs="Times New Roman"/>
+                <w:lang w:eastAsia="zh-CN"/>
+              </w:rPr>
+              <w:t xml:space="preserve">-Are the hypotheses generated significant to the field of urban biodiversity and can they truly guide the development of this </w:t>
+            </w:r>
+            <w:proofErr w:type="gramStart"/>
+            <w:r>
+              <w:rPr>
+                <w:rFonts w:ascii="Times New Roman" w:eastAsiaTheme="minorEastAsia" w:hAnsi="Times New Roman" w:cs="Times New Roman"/>
+                <w:lang w:eastAsia="zh-CN"/>
+              </w:rPr>
+              <w:t>field ?</w:t>
+            </w:r>
+            <w:proofErr w:type="gramEnd"/>
+          </w:p>
+          <w:p>
+            <w:pPr>
+              <w:spacing w:after="0" w:line="240" w:lineRule="auto"/>
+              <w:rPr>
+                <w:rFonts w:ascii="Times New Roman" w:eastAsiaTheme="minorEastAsia" w:hAnsi="Times New Roman" w:cs="Times New Roman"/>
+                <w:lang w:eastAsia="zh-CN"/>
+              </w:rPr>
+            </w:pPr>
+            <w:r>
+              <w:rPr>
+                <w:rFonts w:ascii="Times New Roman" w:eastAsiaTheme="minorEastAsia" w:hAnsi="Times New Roman" w:cs="Times New Roman"/>
+                <w:lang w:eastAsia="zh-CN"/>
+              </w:rPr>
+              <w:t xml:space="preserve">2. **What are the key gaps or weaknesses in the current </w:t>
+            </w:r>
+            <w:proofErr w:type="gramStart"/>
+            <w:r>
+              <w:rPr>
+                <w:rFonts w:ascii="Times New Roman" w:eastAsiaTheme="minorEastAsia" w:hAnsi="Times New Roman" w:cs="Times New Roman"/>
+                <w:lang w:eastAsia="zh-CN"/>
+              </w:rPr>
+              <w:t>discussion?*</w:t>
+            </w:r>
+            <w:proofErr w:type="gramEnd"/>
+            <w:r>
+              <w:rPr>
+                <w:rFonts w:ascii="Times New Roman" w:eastAsiaTheme="minorEastAsia" w:hAnsi="Times New Roman" w:cs="Times New Roman"/>
+                <w:lang w:eastAsia="zh-CN"/>
+              </w:rPr>
+              <w:t>*</w:t>
+            </w:r>
+          </w:p>
+          <w:p>
+            <w:pPr>
+              <w:spacing w:after="0" w:line="240" w:lineRule="auto"/>
+              <w:rPr>
+                <w:rFonts w:ascii="Times New Roman" w:eastAsiaTheme="minorEastAsia" w:hAnsi="Times New Roman" w:cs="Times New Roman"/>
+                <w:lang w:eastAsia="zh-CN"/>
+              </w:rPr>
+            </w:pPr>
+          </w:p>
+          <w:p>
+            <w:pPr>
+              <w:spacing w:after="0" w:line="240" w:lineRule="auto"/>
+              <w:rPr>
+                <w:rFonts w:ascii="Times New Roman" w:eastAsiaTheme="minorEastAsia" w:hAnsi="Times New Roman" w:cs="Times New Roman"/>
+                <w:lang w:eastAsia="zh-CN"/>
+              </w:rPr>
+            </w:pPr>
+            <w:r>
+              <w:rPr>
+                <w:rFonts w:ascii="Times New Roman" w:eastAsiaTheme="minorEastAsia" w:hAnsi="Times New Roman" w:cs="Times New Roman"/>
+                <w:lang w:eastAsia="zh-CN"/>
+              </w:rPr>
+              <w:t>Step 2: Strategic Directive for the Next Round</w:t>
+            </w:r>
+          </w:p>
+          <w:p>
+            <w:pPr>
+              <w:spacing w:after="0" w:line="240" w:lineRule="auto"/>
+              <w:rPr>
+                <w:rFonts w:ascii="Times New Roman" w:eastAsiaTheme="minorEastAsia" w:hAnsi="Times New Roman" w:cs="Times New Roman"/>
+                <w:lang w:eastAsia="zh-CN"/>
+              </w:rPr>
+            </w:pPr>
+            <w:r>
+              <w:rPr>
+                <w:rFonts w:ascii="Times New Roman" w:eastAsiaTheme="minorEastAsia" w:hAnsi="Times New Roman" w:cs="Times New Roman"/>
+                <w:lang w:eastAsia="zh-CN"/>
+              </w:rPr>
+              <w:t xml:space="preserve">Based on your analysis, provide a clear, forward-looking strategy for the team. Your directive should guide the experts **to find high-quality inspirations that are closely related to the </w:t>
+            </w:r>
+            <w:proofErr w:type="gramStart"/>
+            <w:r>
+              <w:rPr>
+                <w:rFonts w:ascii="Times New Roman" w:eastAsiaTheme="minorEastAsia" w:hAnsi="Times New Roman" w:cs="Times New Roman"/>
+                <w:lang w:eastAsia="zh-CN"/>
+              </w:rPr>
+              <w:t>hypothesis.*</w:t>
+            </w:r>
+            <w:proofErr w:type="gramEnd"/>
+            <w:r>
+              <w:rPr>
+                <w:rFonts w:ascii="Times New Roman" w:eastAsiaTheme="minorEastAsia" w:hAnsi="Times New Roman" w:cs="Times New Roman"/>
+                <w:lang w:eastAsia="zh-CN"/>
+              </w:rPr>
+              <w:t>* Please summarize this round of discussions and provide guidance for the next round of discussions or final integration.</w:t>
+            </w:r>
+          </w:p>
+          <w:p>
+            <w:pPr>
+              <w:spacing w:after="0" w:line="240" w:lineRule="auto"/>
+              <w:rPr>
+                <w:rFonts w:ascii="Times New Roman" w:eastAsiaTheme="minorEastAsia" w:hAnsi="Times New Roman" w:cs="Times New Roman"/>
+                <w:lang w:eastAsia="zh-CN"/>
+              </w:rPr>
+            </w:pPr>
+            <w:r>
+              <w:rPr>
+                <w:rFonts w:ascii="Times New Roman" w:eastAsiaTheme="minorEastAsia" w:hAnsi="Times New Roman" w:cs="Times New Roman"/>
+                <w:lang w:eastAsia="zh-CN"/>
+              </w:rPr>
+              <w:t xml:space="preserve"> </w:t>
+            </w:r>
+          </w:p>
+          <w:p>
+            <w:pPr>
+              <w:spacing w:after="0" w:line="240" w:lineRule="auto"/>
+              <w:rPr>
+                <w:rFonts w:ascii="Times New Roman" w:eastAsiaTheme="minorEastAsia" w:hAnsi="Times New Roman" w:cs="Times New Roman"/>
+                <w:lang w:eastAsia="zh-CN"/>
+              </w:rPr>
+            </w:pPr>
+            <w:r>
+              <w:rPr>
+                <w:rFonts w:ascii="Times New Roman" w:eastAsiaTheme="minorEastAsia" w:hAnsi="Times New Roman" w:cs="Times New Roman"/>
+                <w:lang w:eastAsia="zh-CN"/>
+              </w:rPr>
+              <w:t>### Output Format</w:t>
+            </w:r>
+          </w:p>
+          <w:p>
+            <w:pPr>
+              <w:spacing w:after="0" w:line="240" w:lineRule="auto"/>
+              <w:rPr>
+                <w:rFonts w:ascii="Times New Roman" w:eastAsiaTheme="minorEastAsia" w:hAnsi="Times New Roman" w:cs="Times New Roman"/>
+                <w:lang w:eastAsia="zh-CN"/>
+              </w:rPr>
+            </w:pPr>
+            <w:r>
+              <w:rPr>
+                <w:rFonts w:ascii="Times New Roman" w:eastAsiaTheme="minorEastAsia" w:hAnsi="Times New Roman" w:cs="Times New Roman"/>
+                <w:lang w:eastAsia="zh-CN"/>
+              </w:rPr>
+              <w:t>**Strict Output**: Your response needs to follow this strict format, do not include any other text outside the JSON block.</w:t>
+            </w:r>
+          </w:p>
+          <w:p>
+            <w:pPr>
+              <w:spacing w:after="0" w:line="240" w:lineRule="auto"/>
+              <w:rPr>
+                <w:rFonts w:ascii="Times New Roman" w:eastAsiaTheme="minorEastAsia" w:hAnsi="Times New Roman" w:cs="Times New Roman"/>
+                <w:lang w:eastAsia="zh-CN"/>
+              </w:rPr>
+            </w:pPr>
+            <w:r>
+              <w:rPr>
+                <w:rFonts w:ascii="Times New Roman" w:eastAsiaTheme="minorEastAsia" w:hAnsi="Times New Roman" w:cs="Times New Roman"/>
+                <w:lang w:eastAsia="zh-CN"/>
+              </w:rPr>
+              <w:t>The JSON format should strictly be:</w:t>
+            </w:r>
+          </w:p>
+          <w:p>
+            <w:pPr>
+              <w:spacing w:after="0" w:line="240" w:lineRule="auto"/>
+              <w:rPr>
+                <w:rFonts w:ascii="Times New Roman" w:eastAsiaTheme="minorEastAsia" w:hAnsi="Times New Roman" w:cs="Times New Roman"/>
+                <w:lang w:eastAsia="zh-CN"/>
+              </w:rPr>
+            </w:pPr>
+            <w:r>
+              <w:rPr>
+                <w:rFonts w:ascii="Times New Roman" w:eastAsiaTheme="minorEastAsia" w:hAnsi="Times New Roman" w:cs="Times New Roman"/>
+                <w:lang w:eastAsia="zh-CN"/>
+              </w:rPr>
+              <w:t>{{</w:t>
+            </w:r>
+          </w:p>
+          <w:p>
+            <w:pPr>
+              <w:spacing w:after="0" w:line="240" w:lineRule="auto"/>
+              <w:rPr>
+                <w:rFonts w:ascii="Times New Roman" w:eastAsiaTheme="minorEastAsia" w:hAnsi="Times New Roman" w:cs="Times New Roman"/>
+                <w:lang w:eastAsia="zh-CN"/>
+              </w:rPr>
+            </w:pPr>
+            <w:r>
+              <w:rPr>
+                <w:rFonts w:ascii="Times New Roman" w:eastAsiaTheme="minorEastAsia" w:hAnsi="Times New Roman" w:cs="Times New Roman"/>
+                <w:lang w:eastAsia="zh-CN"/>
+              </w:rPr>
               <w:lastRenderedPageBreak/>
-              <w:t>{</w:t>
-            </w:r>
-            <w:proofErr w:type="spellStart"/>
-            <w:r>
-              <w:rPr>
-                <w:rFonts w:ascii="Times New Roman" w:eastAsiaTheme="minorEastAsia" w:hAnsi="Times New Roman" w:cs="Times New Roman"/>
-                <w:lang w:eastAsia="zh-CN"/>
-              </w:rPr>
-              <w:t>current_hypothesis</w:t>
-            </w:r>
-            <w:proofErr w:type="spellEnd"/>
-            <w:r>
-              <w:rPr>
-                <w:rFonts w:ascii="Times New Roman" w:eastAsiaTheme="minorEastAsia" w:hAnsi="Times New Roman" w:cs="Times New Roman"/>
-                <w:lang w:eastAsia="zh-CN"/>
-              </w:rPr>
-              <w:t>}</w:t>
-            </w:r>
-          </w:p>
-          <w:p>
-            <w:pPr>
-              <w:spacing w:after="0" w:line="240" w:lineRule="auto"/>
-              <w:rPr>
-                <w:rFonts w:ascii="Times New Roman" w:eastAsiaTheme="minorEastAsia" w:hAnsi="Times New Roman" w:cs="Times New Roman"/>
-                <w:lang w:eastAsia="zh-CN"/>
-              </w:rPr>
-            </w:pPr>
-            <w:r>
-              <w:rPr>
-                <w:rFonts w:ascii="Times New Roman" w:eastAsiaTheme="minorEastAsia" w:hAnsi="Times New Roman" w:cs="Times New Roman"/>
-                <w:lang w:eastAsia="zh-CN"/>
-              </w:rPr>
-              <w:t xml:space="preserve">### Inspiration Pool of the Curated </w:t>
-            </w:r>
-            <w:proofErr w:type="spellStart"/>
-            <w:r>
-              <w:rPr>
-                <w:rFonts w:ascii="Times New Roman" w:eastAsiaTheme="minorEastAsia" w:hAnsi="Times New Roman" w:cs="Times New Roman"/>
-                <w:lang w:eastAsia="zh-CN"/>
-              </w:rPr>
-              <w:t>literature_library</w:t>
-            </w:r>
-            <w:proofErr w:type="spellEnd"/>
-          </w:p>
-          <w:p>
-            <w:pPr>
-              <w:spacing w:after="0" w:line="240" w:lineRule="auto"/>
-              <w:rPr>
-                <w:rFonts w:ascii="Times New Roman" w:eastAsiaTheme="minorEastAsia" w:hAnsi="Times New Roman" w:cs="Times New Roman"/>
-                <w:lang w:eastAsia="zh-CN"/>
-              </w:rPr>
-            </w:pPr>
-            <w:r>
-              <w:rPr>
-                <w:rFonts w:ascii="Times New Roman" w:eastAsiaTheme="minorEastAsia" w:hAnsi="Times New Roman" w:cs="Times New Roman"/>
-                <w:lang w:eastAsia="zh-CN"/>
-              </w:rPr>
-              <w:t>{</w:t>
-            </w:r>
-            <w:proofErr w:type="spellStart"/>
-            <w:r>
-              <w:rPr>
-                <w:rFonts w:ascii="Times New Roman" w:eastAsiaTheme="minorEastAsia" w:hAnsi="Times New Roman" w:cs="Times New Roman"/>
-                <w:lang w:eastAsia="zh-CN"/>
-              </w:rPr>
-              <w:t>curated_literature_library_inspiration_pool</w:t>
-            </w:r>
-            <w:proofErr w:type="spellEnd"/>
-            <w:r>
-              <w:rPr>
-                <w:rFonts w:ascii="Times New Roman" w:eastAsiaTheme="minorEastAsia" w:hAnsi="Times New Roman" w:cs="Times New Roman"/>
-                <w:lang w:eastAsia="zh-CN"/>
-              </w:rPr>
-              <w:t xml:space="preserve">} </w:t>
-            </w:r>
-          </w:p>
-          <w:p>
-            <w:pPr>
-              <w:spacing w:after="0" w:line="240" w:lineRule="auto"/>
-              <w:rPr>
-                <w:rFonts w:ascii="Times New Roman" w:eastAsiaTheme="minorEastAsia" w:hAnsi="Times New Roman" w:cs="Times New Roman"/>
-                <w:lang w:eastAsia="zh-CN"/>
-              </w:rPr>
-            </w:pPr>
-            <w:r>
-              <w:rPr>
-                <w:rFonts w:ascii="Times New Roman" w:eastAsiaTheme="minorEastAsia" w:hAnsi="Times New Roman" w:cs="Times New Roman"/>
-                <w:lang w:eastAsia="zh-CN"/>
-              </w:rPr>
-              <w:t>### Retrieved literature library related to the hypothesis:</w:t>
-            </w:r>
-          </w:p>
-          <w:p>
-            <w:pPr>
-              <w:spacing w:after="0" w:line="240" w:lineRule="auto"/>
-              <w:rPr>
-                <w:rFonts w:ascii="Times New Roman" w:eastAsiaTheme="minorEastAsia" w:hAnsi="Times New Roman" w:cs="Times New Roman"/>
-                <w:lang w:eastAsia="zh-CN"/>
-              </w:rPr>
-            </w:pPr>
-            <w:r>
-              <w:rPr>
-                <w:rFonts w:ascii="Times New Roman" w:eastAsiaTheme="minorEastAsia" w:hAnsi="Times New Roman" w:cs="Times New Roman"/>
-                <w:lang w:eastAsia="zh-CN"/>
-              </w:rPr>
-              <w:t>**The papers are organized in the form of chains of papers, from early to late**</w:t>
-            </w:r>
-          </w:p>
-          <w:p>
-            <w:pPr>
-              <w:spacing w:after="0" w:line="240" w:lineRule="auto"/>
-              <w:rPr>
-                <w:rFonts w:ascii="Times New Roman" w:eastAsiaTheme="minorEastAsia" w:hAnsi="Times New Roman" w:cs="Times New Roman"/>
-                <w:lang w:eastAsia="zh-CN"/>
-              </w:rPr>
-            </w:pPr>
-            <w:r>
-              <w:rPr>
-                <w:rFonts w:ascii="Times New Roman" w:eastAsiaTheme="minorEastAsia" w:hAnsi="Times New Roman" w:cs="Times New Roman"/>
-                <w:lang w:eastAsia="zh-CN"/>
-              </w:rPr>
-              <w:t>{</w:t>
-            </w:r>
-            <w:proofErr w:type="spellStart"/>
-            <w:r>
-              <w:rPr>
-                <w:rFonts w:ascii="Times New Roman" w:eastAsiaTheme="minorEastAsia" w:hAnsi="Times New Roman" w:cs="Times New Roman"/>
-                <w:lang w:eastAsia="zh-CN"/>
-              </w:rPr>
-              <w:t>retrieved_literature_library</w:t>
-            </w:r>
-            <w:proofErr w:type="spellEnd"/>
-            <w:r>
-              <w:rPr>
-                <w:rFonts w:ascii="Times New Roman" w:eastAsiaTheme="minorEastAsia" w:hAnsi="Times New Roman" w:cs="Times New Roman"/>
-                <w:lang w:eastAsia="zh-CN"/>
-              </w:rPr>
-              <w:t>}</w:t>
-            </w:r>
-          </w:p>
-          <w:p>
-            <w:pPr>
-              <w:spacing w:after="0" w:line="240" w:lineRule="auto"/>
-              <w:rPr>
-                <w:rFonts w:ascii="Times New Roman" w:eastAsiaTheme="minorEastAsia" w:hAnsi="Times New Roman" w:cs="Times New Roman"/>
-                <w:lang w:eastAsia="zh-CN"/>
-              </w:rPr>
-            </w:pPr>
-            <w:r>
-              <w:rPr>
-                <w:rFonts w:ascii="Times New Roman" w:eastAsiaTheme="minorEastAsia" w:hAnsi="Times New Roman" w:cs="Times New Roman"/>
-                <w:lang w:eastAsia="zh-CN"/>
-              </w:rPr>
-              <w:t>### Discussions so far:</w:t>
-            </w:r>
-          </w:p>
-          <w:p>
-            <w:pPr>
-              <w:spacing w:after="0" w:line="240" w:lineRule="auto"/>
-              <w:rPr>
-                <w:rFonts w:ascii="Times New Roman" w:eastAsiaTheme="minorEastAsia" w:hAnsi="Times New Roman" w:cs="Times New Roman"/>
-                <w:lang w:eastAsia="zh-CN"/>
-              </w:rPr>
-            </w:pPr>
-            <w:r>
-              <w:rPr>
-                <w:rFonts w:ascii="Times New Roman" w:eastAsiaTheme="minorEastAsia" w:hAnsi="Times New Roman" w:cs="Times New Roman"/>
-                <w:lang w:eastAsia="zh-CN"/>
-              </w:rPr>
-              <w:t>{</w:t>
-            </w:r>
-            <w:proofErr w:type="spellStart"/>
-            <w:r>
-              <w:rPr>
-                <w:rFonts w:ascii="Times New Roman" w:eastAsiaTheme="minorEastAsia" w:hAnsi="Times New Roman" w:cs="Times New Roman"/>
-                <w:lang w:eastAsia="zh-CN"/>
-              </w:rPr>
-              <w:t>discussion_history</w:t>
-            </w:r>
-            <w:proofErr w:type="spellEnd"/>
-            <w:r>
-              <w:rPr>
-                <w:rFonts w:ascii="Times New Roman" w:eastAsiaTheme="minorEastAsia" w:hAnsi="Times New Roman" w:cs="Times New Roman"/>
-                <w:lang w:eastAsia="zh-CN"/>
-              </w:rPr>
-              <w:t>}</w:t>
-            </w:r>
-          </w:p>
-          <w:p>
-            <w:pPr>
-              <w:spacing w:after="0" w:line="240" w:lineRule="auto"/>
-              <w:rPr>
-                <w:rFonts w:ascii="Times New Roman" w:eastAsiaTheme="minorEastAsia" w:hAnsi="Times New Roman" w:cs="Times New Roman"/>
-                <w:lang w:eastAsia="zh-CN"/>
-              </w:rPr>
-            </w:pPr>
-            <w:r>
-              <w:rPr>
-                <w:rFonts w:ascii="Times New Roman" w:eastAsiaTheme="minorEastAsia" w:hAnsi="Times New Roman" w:cs="Times New Roman"/>
-                <w:lang w:eastAsia="zh-CN"/>
-              </w:rPr>
-              <w:t>------------------ END OF KNOWLEDGE ------------------</w:t>
-            </w:r>
-          </w:p>
-          <w:p>
-            <w:pPr>
-              <w:spacing w:after="0" w:line="240" w:lineRule="auto"/>
-              <w:rPr>
-                <w:rFonts w:ascii="Times New Roman" w:eastAsiaTheme="minorEastAsia" w:hAnsi="Times New Roman" w:cs="Times New Roman"/>
-                <w:lang w:eastAsia="zh-CN"/>
-              </w:rPr>
-            </w:pPr>
-          </w:p>
-          <w:p>
-            <w:pPr>
-              <w:spacing w:after="0" w:line="240" w:lineRule="auto"/>
-              <w:rPr>
-                <w:rFonts w:ascii="Times New Roman" w:eastAsiaTheme="minorEastAsia" w:hAnsi="Times New Roman" w:cs="Times New Roman"/>
-                <w:lang w:eastAsia="zh-CN"/>
-              </w:rPr>
-            </w:pPr>
-            <w:r>
-              <w:rPr>
-                <w:rFonts w:ascii="Times New Roman" w:eastAsiaTheme="minorEastAsia" w:hAnsi="Times New Roman" w:cs="Times New Roman"/>
-                <w:lang w:eastAsia="zh-CN"/>
-              </w:rPr>
-              <w:t>------------------ BEGIN OF DETAILED INSTRUCTIONS ------------------</w:t>
-            </w:r>
-          </w:p>
-          <w:p>
-            <w:pPr>
-              <w:spacing w:after="0" w:line="240" w:lineRule="auto"/>
-              <w:rPr>
-                <w:rFonts w:ascii="Times New Roman" w:eastAsiaTheme="minorEastAsia" w:hAnsi="Times New Roman" w:cs="Times New Roman"/>
-                <w:lang w:eastAsia="zh-CN"/>
-              </w:rPr>
-            </w:pPr>
-            <w:r>
-              <w:rPr>
-                <w:rFonts w:ascii="Times New Roman" w:eastAsiaTheme="minorEastAsia" w:hAnsi="Times New Roman" w:cs="Times New Roman"/>
-                <w:lang w:eastAsia="zh-CN"/>
-              </w:rPr>
-              <w:t>## Detailed Instructions</w:t>
-            </w:r>
-          </w:p>
-          <w:p>
-            <w:pPr>
-              <w:spacing w:after="0" w:line="240" w:lineRule="auto"/>
-              <w:rPr>
-                <w:rFonts w:ascii="Times New Roman" w:eastAsiaTheme="minorEastAsia" w:hAnsi="Times New Roman" w:cs="Times New Roman"/>
-                <w:lang w:eastAsia="zh-CN"/>
-              </w:rPr>
-            </w:pPr>
-            <w:r>
-              <w:rPr>
-                <w:rFonts w:ascii="Times New Roman" w:eastAsiaTheme="minorEastAsia" w:hAnsi="Times New Roman" w:cs="Times New Roman"/>
-                <w:lang w:eastAsia="zh-CN"/>
-              </w:rPr>
-              <w:t>**Now, based on the Task and the Knowledge above, follow these instructions precisely**.</w:t>
-            </w:r>
-          </w:p>
-          <w:p>
-            <w:pPr>
-              <w:spacing w:after="0" w:line="240" w:lineRule="auto"/>
-              <w:rPr>
-                <w:rFonts w:ascii="Times New Roman" w:eastAsiaTheme="minorEastAsia" w:hAnsi="Times New Roman" w:cs="Times New Roman"/>
-                <w:lang w:eastAsia="zh-CN"/>
-              </w:rPr>
-            </w:pPr>
-          </w:p>
-          <w:p>
-            <w:pPr>
-              <w:spacing w:after="0" w:line="240" w:lineRule="auto"/>
-              <w:rPr>
-                <w:rFonts w:ascii="Times New Roman" w:eastAsiaTheme="minorEastAsia" w:hAnsi="Times New Roman" w:cs="Times New Roman"/>
-                <w:lang w:eastAsia="zh-CN"/>
-              </w:rPr>
-            </w:pPr>
-            <w:r>
-              <w:rPr>
-                <w:rFonts w:ascii="Times New Roman" w:eastAsiaTheme="minorEastAsia" w:hAnsi="Times New Roman" w:cs="Times New Roman"/>
-                <w:lang w:eastAsia="zh-CN"/>
-              </w:rPr>
-              <w:t>### Method</w:t>
-            </w:r>
-          </w:p>
-          <w:p>
-            <w:pPr>
-              <w:spacing w:after="0" w:line="240" w:lineRule="auto"/>
-              <w:rPr>
-                <w:rFonts w:ascii="Times New Roman" w:eastAsiaTheme="minorEastAsia" w:hAnsi="Times New Roman" w:cs="Times New Roman"/>
-                <w:lang w:eastAsia="zh-CN"/>
-              </w:rPr>
-            </w:pPr>
-            <w:r>
-              <w:rPr>
-                <w:rFonts w:ascii="Times New Roman" w:eastAsiaTheme="minorEastAsia" w:hAnsi="Times New Roman" w:cs="Times New Roman"/>
-                <w:lang w:eastAsia="zh-CN"/>
-              </w:rPr>
-              <w:t>Step 1: Analytical Summary</w:t>
-            </w:r>
-          </w:p>
-          <w:p>
-            <w:pPr>
-              <w:spacing w:after="0" w:line="240" w:lineRule="auto"/>
-              <w:rPr>
-                <w:rFonts w:ascii="Times New Roman" w:eastAsiaTheme="minorEastAsia" w:hAnsi="Times New Roman" w:cs="Times New Roman"/>
-                <w:lang w:eastAsia="zh-CN"/>
-              </w:rPr>
-            </w:pPr>
-            <w:r>
-              <w:rPr>
-                <w:rFonts w:ascii="Times New Roman" w:eastAsiaTheme="minorEastAsia" w:hAnsi="Times New Roman" w:cs="Times New Roman"/>
-                <w:lang w:eastAsia="zh-CN"/>
-              </w:rPr>
-              <w:t>First, critically analyze the current state of the discussion and the inspirations generated. You must answer these questions:</w:t>
-            </w:r>
-          </w:p>
-          <w:p>
-            <w:pPr>
-              <w:spacing w:after="0" w:line="240" w:lineRule="auto"/>
-              <w:rPr>
-                <w:rFonts w:ascii="Times New Roman" w:eastAsiaTheme="minorEastAsia" w:hAnsi="Times New Roman" w:cs="Times New Roman"/>
-                <w:lang w:eastAsia="zh-CN"/>
-              </w:rPr>
-            </w:pPr>
-            <w:r>
-              <w:rPr>
-                <w:rFonts w:ascii="Times New Roman" w:eastAsiaTheme="minorEastAsia" w:hAnsi="Times New Roman" w:cs="Times New Roman"/>
-                <w:lang w:eastAsia="zh-CN"/>
-              </w:rPr>
-              <w:t xml:space="preserve">1. **What is the overall quality, importance and novelty of the inspirations so </w:t>
-            </w:r>
-            <w:proofErr w:type="gramStart"/>
-            <w:r>
-              <w:rPr>
-                <w:rFonts w:ascii="Times New Roman" w:eastAsiaTheme="minorEastAsia" w:hAnsi="Times New Roman" w:cs="Times New Roman"/>
-                <w:lang w:eastAsia="zh-CN"/>
-              </w:rPr>
-              <w:t>far?*</w:t>
-            </w:r>
-            <w:proofErr w:type="gramEnd"/>
-            <w:r>
-              <w:rPr>
-                <w:rFonts w:ascii="Times New Roman" w:eastAsiaTheme="minorEastAsia" w:hAnsi="Times New Roman" w:cs="Times New Roman"/>
-                <w:lang w:eastAsia="zh-CN"/>
-              </w:rPr>
-              <w:t>*</w:t>
-            </w:r>
-          </w:p>
-          <w:p>
-            <w:pPr>
-              <w:spacing w:after="0" w:line="240" w:lineRule="auto"/>
-              <w:rPr>
-                <w:rFonts w:ascii="Times New Roman" w:eastAsiaTheme="minorEastAsia" w:hAnsi="Times New Roman" w:cs="Times New Roman"/>
-                <w:lang w:eastAsia="zh-CN"/>
-              </w:rPr>
-            </w:pPr>
-            <w:r>
-              <w:rPr>
-                <w:rFonts w:ascii="Times New Roman" w:eastAsiaTheme="minorEastAsia" w:hAnsi="Times New Roman" w:cs="Times New Roman"/>
-                <w:lang w:eastAsia="zh-CN"/>
-              </w:rPr>
-              <w:t>-To what extent do the generated hypotheses demonstrate genuine novelty compared to existing urban biodiversity literature?</w:t>
-            </w:r>
-          </w:p>
-          <w:p>
-            <w:pPr>
-              <w:spacing w:after="0" w:line="240" w:lineRule="auto"/>
-              <w:rPr>
-                <w:rFonts w:ascii="Times New Roman" w:eastAsiaTheme="minorEastAsia" w:hAnsi="Times New Roman" w:cs="Times New Roman"/>
-                <w:lang w:eastAsia="zh-CN"/>
-              </w:rPr>
-            </w:pPr>
-            <w:r>
-              <w:rPr>
-                <w:rFonts w:ascii="Times New Roman" w:eastAsiaTheme="minorEastAsia" w:hAnsi="Times New Roman" w:cs="Times New Roman"/>
-                <w:lang w:eastAsia="zh-CN"/>
-              </w:rPr>
-              <w:t xml:space="preserve">-Are the hypotheses generated significant to the field of urban biodiversity and can they truly guide the development of this </w:t>
-            </w:r>
-            <w:proofErr w:type="gramStart"/>
-            <w:r>
-              <w:rPr>
-                <w:rFonts w:ascii="Times New Roman" w:eastAsiaTheme="minorEastAsia" w:hAnsi="Times New Roman" w:cs="Times New Roman"/>
-                <w:lang w:eastAsia="zh-CN"/>
-              </w:rPr>
-              <w:t>field ?</w:t>
-            </w:r>
-            <w:proofErr w:type="gramEnd"/>
-          </w:p>
-          <w:p>
-            <w:pPr>
-              <w:spacing w:after="0" w:line="240" w:lineRule="auto"/>
-              <w:rPr>
-                <w:rFonts w:ascii="Times New Roman" w:eastAsiaTheme="minorEastAsia" w:hAnsi="Times New Roman" w:cs="Times New Roman"/>
-                <w:lang w:eastAsia="zh-CN"/>
-              </w:rPr>
-            </w:pPr>
-            <w:r>
-              <w:rPr>
-                <w:rFonts w:ascii="Times New Roman" w:eastAsiaTheme="minorEastAsia" w:hAnsi="Times New Roman" w:cs="Times New Roman"/>
-                <w:lang w:eastAsia="zh-CN"/>
-              </w:rPr>
-              <w:t xml:space="preserve">2. **What are the key gaps or weaknesses in the current </w:t>
-            </w:r>
-            <w:proofErr w:type="gramStart"/>
-            <w:r>
-              <w:rPr>
-                <w:rFonts w:ascii="Times New Roman" w:eastAsiaTheme="minorEastAsia" w:hAnsi="Times New Roman" w:cs="Times New Roman"/>
-                <w:lang w:eastAsia="zh-CN"/>
-              </w:rPr>
-              <w:t>discussion?*</w:t>
-            </w:r>
-            <w:proofErr w:type="gramEnd"/>
-            <w:r>
-              <w:rPr>
-                <w:rFonts w:ascii="Times New Roman" w:eastAsiaTheme="minorEastAsia" w:hAnsi="Times New Roman" w:cs="Times New Roman"/>
-                <w:lang w:eastAsia="zh-CN"/>
-              </w:rPr>
-              <w:t>*</w:t>
-            </w:r>
-          </w:p>
-          <w:p>
-            <w:pPr>
-              <w:spacing w:after="0" w:line="240" w:lineRule="auto"/>
-              <w:rPr>
-                <w:rFonts w:ascii="Times New Roman" w:eastAsiaTheme="minorEastAsia" w:hAnsi="Times New Roman" w:cs="Times New Roman"/>
-                <w:lang w:eastAsia="zh-CN"/>
-              </w:rPr>
-            </w:pPr>
-          </w:p>
-          <w:p>
-            <w:pPr>
-              <w:spacing w:after="0" w:line="240" w:lineRule="auto"/>
-              <w:rPr>
-                <w:rFonts w:ascii="Times New Roman" w:eastAsiaTheme="minorEastAsia" w:hAnsi="Times New Roman" w:cs="Times New Roman"/>
-                <w:lang w:eastAsia="zh-CN"/>
-              </w:rPr>
-            </w:pPr>
-            <w:r>
-              <w:rPr>
-                <w:rFonts w:ascii="Times New Roman" w:eastAsiaTheme="minorEastAsia" w:hAnsi="Times New Roman" w:cs="Times New Roman"/>
-                <w:lang w:eastAsia="zh-CN"/>
-              </w:rPr>
-              <w:t>Step 2: Strategic Directive for the Next Round</w:t>
-            </w:r>
-          </w:p>
-          <w:p>
-            <w:pPr>
-              <w:spacing w:after="0" w:line="240" w:lineRule="auto"/>
-              <w:rPr>
-                <w:rFonts w:ascii="Times New Roman" w:eastAsiaTheme="minorEastAsia" w:hAnsi="Times New Roman" w:cs="Times New Roman"/>
-                <w:lang w:eastAsia="zh-CN"/>
-              </w:rPr>
-            </w:pPr>
-            <w:r>
-              <w:rPr>
-                <w:rFonts w:ascii="Times New Roman" w:eastAsiaTheme="minorEastAsia" w:hAnsi="Times New Roman" w:cs="Times New Roman"/>
-                <w:lang w:eastAsia="zh-CN"/>
-              </w:rPr>
-              <w:t xml:space="preserve">Based on your analysis, provide a clear, forward-looking strategy for the team. Your directive should guide the experts **to find high-quality inspirations that are closely related to the </w:t>
-            </w:r>
-            <w:proofErr w:type="gramStart"/>
-            <w:r>
-              <w:rPr>
-                <w:rFonts w:ascii="Times New Roman" w:eastAsiaTheme="minorEastAsia" w:hAnsi="Times New Roman" w:cs="Times New Roman"/>
-                <w:lang w:eastAsia="zh-CN"/>
-              </w:rPr>
-              <w:t>hypothesis.*</w:t>
-            </w:r>
-            <w:proofErr w:type="gramEnd"/>
-            <w:r>
-              <w:rPr>
-                <w:rFonts w:ascii="Times New Roman" w:eastAsiaTheme="minorEastAsia" w:hAnsi="Times New Roman" w:cs="Times New Roman"/>
-                <w:lang w:eastAsia="zh-CN"/>
-              </w:rPr>
-              <w:t>* Please summarize this round of discussions and provide guidance for the next round of discussions or final integration.</w:t>
-            </w:r>
-          </w:p>
-          <w:p>
-            <w:pPr>
-              <w:spacing w:after="0" w:line="240" w:lineRule="auto"/>
-              <w:rPr>
-                <w:rFonts w:ascii="Times New Roman" w:eastAsiaTheme="minorEastAsia" w:hAnsi="Times New Roman" w:cs="Times New Roman"/>
-                <w:lang w:eastAsia="zh-CN"/>
-              </w:rPr>
-            </w:pPr>
-            <w:r>
-              <w:rPr>
-                <w:rFonts w:ascii="Times New Roman" w:eastAsiaTheme="minorEastAsia" w:hAnsi="Times New Roman" w:cs="Times New Roman"/>
-                <w:lang w:eastAsia="zh-CN"/>
-              </w:rPr>
-              <w:t xml:space="preserve"> </w:t>
-            </w:r>
-          </w:p>
-          <w:p>
-            <w:pPr>
-              <w:spacing w:after="0" w:line="240" w:lineRule="auto"/>
-              <w:rPr>
-                <w:rFonts w:ascii="Times New Roman" w:eastAsiaTheme="minorEastAsia" w:hAnsi="Times New Roman" w:cs="Times New Roman"/>
-                <w:lang w:eastAsia="zh-CN"/>
-              </w:rPr>
-            </w:pPr>
-            <w:r>
-              <w:rPr>
-                <w:rFonts w:ascii="Times New Roman" w:eastAsiaTheme="minorEastAsia" w:hAnsi="Times New Roman" w:cs="Times New Roman"/>
-                <w:lang w:eastAsia="zh-CN"/>
-              </w:rPr>
-              <w:t>### Output Format</w:t>
-            </w:r>
-          </w:p>
-          <w:p>
-            <w:pPr>
-              <w:spacing w:after="0" w:line="240" w:lineRule="auto"/>
-              <w:rPr>
-                <w:rFonts w:ascii="Times New Roman" w:eastAsiaTheme="minorEastAsia" w:hAnsi="Times New Roman" w:cs="Times New Roman"/>
-                <w:lang w:eastAsia="zh-CN"/>
-              </w:rPr>
-            </w:pPr>
-            <w:r>
-              <w:rPr>
-                <w:rFonts w:ascii="Times New Roman" w:eastAsiaTheme="minorEastAsia" w:hAnsi="Times New Roman" w:cs="Times New Roman"/>
-                <w:lang w:eastAsia="zh-CN"/>
-              </w:rPr>
-              <w:t>**Strict Output**: Your response needs to follow this strict format, do not include any other text outside the JSON block.</w:t>
-            </w:r>
-          </w:p>
-          <w:p>
-            <w:pPr>
-              <w:spacing w:after="0" w:line="240" w:lineRule="auto"/>
-              <w:rPr>
-                <w:rFonts w:ascii="Times New Roman" w:eastAsiaTheme="minorEastAsia" w:hAnsi="Times New Roman" w:cs="Times New Roman"/>
-                <w:lang w:eastAsia="zh-CN"/>
-              </w:rPr>
-            </w:pPr>
-            <w:r>
-              <w:rPr>
-                <w:rFonts w:ascii="Times New Roman" w:eastAsiaTheme="minorEastAsia" w:hAnsi="Times New Roman" w:cs="Times New Roman"/>
-                <w:lang w:eastAsia="zh-CN"/>
-              </w:rPr>
-              <w:t>The JSON format should strictly be:</w:t>
-            </w:r>
-          </w:p>
-          <w:p>
-            <w:pPr>
-              <w:spacing w:after="0" w:line="240" w:lineRule="auto"/>
-              <w:rPr>
-                <w:rFonts w:ascii="Times New Roman" w:eastAsiaTheme="minorEastAsia" w:hAnsi="Times New Roman" w:cs="Times New Roman"/>
-                <w:lang w:eastAsia="zh-CN"/>
-              </w:rPr>
-            </w:pPr>
-            <w:r>
-              <w:rPr>
-                <w:rFonts w:ascii="Times New Roman" w:eastAsiaTheme="minorEastAsia" w:hAnsi="Times New Roman" w:cs="Times New Roman"/>
-                <w:lang w:eastAsia="zh-CN"/>
-              </w:rPr>
-              <w:t>{{</w:t>
-            </w:r>
-          </w:p>
-          <w:p>
-            <w:pPr>
-              <w:spacing w:after="0" w:line="240" w:lineRule="auto"/>
-              <w:rPr>
-                <w:rFonts w:ascii="Times New Roman" w:eastAsiaTheme="minorEastAsia" w:hAnsi="Times New Roman" w:cs="Times New Roman"/>
-                <w:lang w:eastAsia="zh-CN"/>
-              </w:rPr>
-            </w:pPr>
-            <w:r>
-              <w:rPr>
-                <w:rFonts w:ascii="Times New Roman" w:eastAsiaTheme="minorEastAsia" w:hAnsi="Times New Roman" w:cs="Times New Roman"/>
-                <w:lang w:eastAsia="zh-CN"/>
-              </w:rPr>
               <w:t>"Summary": "[The Analytical Summary]",</w:t>
             </w:r>
           </w:p>
@@ -8656,7 +8640,6 @@
           <w:rFonts w:ascii="Times New Roman" w:hAnsi="Times New Roman" w:cs="Times New Roman"/>
           <w:b/>
         </w:rPr>
-        <w:lastRenderedPageBreak/>
         <w:t xml:space="preserve">Supplementary Table </w:t>
       </w:r>
       <w:r>
@@ -9367,6 +9350,7 @@
                 <w:rFonts w:ascii="Times New Roman" w:eastAsiaTheme="minorEastAsia" w:hAnsi="Times New Roman" w:cs="Times New Roman"/>
                 <w:lang w:eastAsia="zh-CN"/>
               </w:rPr>
+              <w:lastRenderedPageBreak/>
               <w:t>2. **The hypothesis should be closely related to the research topic**.</w:t>
             </w:r>
           </w:p>
@@ -9383,7 +9367,6 @@
                 <w:rFonts w:ascii="Times New Roman" w:eastAsiaTheme="minorEastAsia" w:hAnsi="Times New Roman" w:cs="Times New Roman"/>
                 <w:lang w:eastAsia="zh-CN"/>
               </w:rPr>
-              <w:lastRenderedPageBreak/>
               <w:t>3. Avoid copying inspirations directly. **The hypothesis must be genuinely novel, not a predictable extension of the provided text**.</w:t>
             </w:r>
           </w:p>
@@ -9779,7 +9762,6 @@
                 <w:rFonts w:ascii="Times New Roman" w:eastAsiaTheme="minorEastAsia" w:hAnsi="Times New Roman" w:cs="Times New Roman"/>
                 <w:lang w:eastAsia="zh-CN"/>
               </w:rPr>
-              <w:lastRenderedPageBreak/>
               <w:t>"Reasoning": "Provide the scientific rationale for why this hypothesis could be true, explain the causal mechanisms, supporting evidence, or theoretical basis, rather than describing how the hypothesis was revised or how feedback was incorporated.",</w:t>
             </w:r>
           </w:p>
@@ -9936,6 +9918,7 @@
                 <w:rFonts w:ascii="Times New Roman" w:eastAsiaTheme="minorEastAsia" w:hAnsi="Times New Roman" w:cs="Times New Roman"/>
                 <w:lang w:eastAsia="zh-CN"/>
               </w:rPr>
+              <w:lastRenderedPageBreak/>
               <w:t>{</w:t>
             </w:r>
             <w:proofErr w:type="spellStart"/>
@@ -10370,104 +10353,111 @@
                 <w:rFonts w:ascii="Times New Roman" w:eastAsiaTheme="minorEastAsia" w:hAnsi="Times New Roman" w:cs="Times New Roman"/>
                 <w:lang w:eastAsia="zh-CN"/>
               </w:rPr>
+              <w:t>1. Follow **Core characteristics of a good hypothesis** provided above.</w:t>
+            </w:r>
+          </w:p>
+          <w:p>
+            <w:pPr>
+              <w:spacing w:after="0" w:line="240" w:lineRule="auto"/>
+              <w:rPr>
+                <w:rFonts w:ascii="Times New Roman" w:eastAsiaTheme="minorEastAsia" w:hAnsi="Times New Roman" w:cs="Times New Roman"/>
+                <w:lang w:eastAsia="zh-CN"/>
+              </w:rPr>
+            </w:pPr>
+            <w:r>
+              <w:rPr>
+                <w:rFonts w:ascii="Times New Roman" w:eastAsiaTheme="minorEastAsia" w:hAnsi="Times New Roman" w:cs="Times New Roman"/>
+                <w:lang w:eastAsia="zh-CN"/>
+              </w:rPr>
+              <w:t>2. **The hypothesis should be closely related to the research topic**.</w:t>
+            </w:r>
+          </w:p>
+          <w:p>
+            <w:pPr>
+              <w:spacing w:after="0" w:line="240" w:lineRule="auto"/>
+              <w:rPr>
+                <w:rFonts w:ascii="Times New Roman" w:eastAsiaTheme="minorEastAsia" w:hAnsi="Times New Roman" w:cs="Times New Roman"/>
+                <w:lang w:eastAsia="zh-CN"/>
+              </w:rPr>
+            </w:pPr>
+            <w:r>
+              <w:rPr>
+                <w:rFonts w:ascii="Times New Roman" w:eastAsiaTheme="minorEastAsia" w:hAnsi="Times New Roman" w:cs="Times New Roman"/>
+                <w:lang w:eastAsia="zh-CN"/>
+              </w:rPr>
+              <w:t xml:space="preserve">3. **The hypothesis must be genuinely novel, not a predictable extension of the provided text**. </w:t>
+            </w:r>
+          </w:p>
+          <w:p>
+            <w:pPr>
+              <w:spacing w:after="0" w:line="240" w:lineRule="auto"/>
+              <w:rPr>
+                <w:rFonts w:ascii="Times New Roman" w:eastAsiaTheme="minorEastAsia" w:hAnsi="Times New Roman" w:cs="Times New Roman"/>
+                <w:lang w:eastAsia="zh-CN"/>
+              </w:rPr>
+            </w:pPr>
+            <w:r>
+              <w:rPr>
+                <w:rFonts w:ascii="Times New Roman" w:eastAsiaTheme="minorEastAsia" w:hAnsi="Times New Roman" w:cs="Times New Roman"/>
+                <w:lang w:eastAsia="zh-CN"/>
+              </w:rPr>
+              <w:t>4. **The hypothesis should be stated in a clear and concise manner**. Complex reasoning, multi-step causal pathways, or detailed theoretical justification should be placed in the Reasoning section, not embedded within the hypothesis itself.</w:t>
+            </w:r>
+          </w:p>
+          <w:p>
+            <w:pPr>
+              <w:spacing w:after="0" w:line="240" w:lineRule="auto"/>
+              <w:rPr>
+                <w:rFonts w:ascii="Times New Roman" w:eastAsiaTheme="minorEastAsia" w:hAnsi="Times New Roman" w:cs="Times New Roman"/>
+                <w:lang w:eastAsia="zh-CN"/>
+              </w:rPr>
+            </w:pPr>
+            <w:r>
+              <w:rPr>
+                <w:rFonts w:ascii="Times New Roman" w:eastAsiaTheme="minorEastAsia" w:hAnsi="Times New Roman" w:cs="Times New Roman"/>
+                <w:lang w:eastAsia="zh-CN"/>
+              </w:rPr>
+              <w:t>5. The hypothesis must be a **coherent and logically grounded conjecture**, not the aggregation of unrelated factors or inspirations.</w:t>
+            </w:r>
+          </w:p>
+          <w:p>
+            <w:pPr>
+              <w:spacing w:after="0" w:line="240" w:lineRule="auto"/>
+              <w:rPr>
+                <w:rFonts w:ascii="Times New Roman" w:eastAsiaTheme="minorEastAsia" w:hAnsi="Times New Roman" w:cs="Times New Roman"/>
+                <w:lang w:eastAsia="zh-CN"/>
+              </w:rPr>
+            </w:pPr>
+            <w:r>
+              <w:rPr>
+                <w:rFonts w:ascii="Times New Roman" w:eastAsiaTheme="minorEastAsia" w:hAnsi="Times New Roman" w:cs="Times New Roman"/>
+                <w:lang w:eastAsia="zh-CN"/>
+              </w:rPr>
+              <w:t>6. **Avoid creating overly complex or abstract hypotheses that cannot be empirically tested within reasonable experimental or observational frameworks**. Additionally, note that a hypothesis is not the same as an experimental design. Therefore, it should not attempt to specify concrete experimental procedures or numerical parameters. The pathway to verification or falsification should be clear, feasible, and should not rely on excessive or unverified assumptions.</w:t>
+            </w:r>
+          </w:p>
+          <w:p>
+            <w:pPr>
+              <w:spacing w:after="0" w:line="240" w:lineRule="auto"/>
+              <w:rPr>
+                <w:rFonts w:ascii="Times New Roman" w:eastAsiaTheme="minorEastAsia" w:hAnsi="Times New Roman" w:cs="Times New Roman"/>
+                <w:lang w:eastAsia="zh-CN"/>
+              </w:rPr>
+            </w:pPr>
+            <w:r>
+              <w:rPr>
+                <w:rFonts w:ascii="Times New Roman" w:eastAsiaTheme="minorEastAsia" w:hAnsi="Times New Roman" w:cs="Times New Roman"/>
+                <w:lang w:eastAsia="zh-CN"/>
+              </w:rPr>
+              <w:t xml:space="preserve">7. **When generating hypotheses, focus on major and direct ecological mechanisms rather than long and speculative causal chains. Avoid hypotheses that rely on multiple indirect steps or unlikely intermediary events to link cause and effect. A hypothesis should explain </w:t>
+            </w:r>
+            <w:r>
+              <w:rPr>
+                <w:rFonts w:ascii="Times New Roman" w:eastAsiaTheme="minorEastAsia" w:hAnsi="Times New Roman" w:cs="Times New Roman"/>
+                <w:lang w:eastAsia="zh-CN"/>
+              </w:rPr>
               <w:lastRenderedPageBreak/>
-              <w:t>1. Follow **Core characteristics of a good hypothesis** provided above.</w:t>
-            </w:r>
-          </w:p>
-          <w:p>
-            <w:pPr>
-              <w:spacing w:after="0" w:line="240" w:lineRule="auto"/>
-              <w:rPr>
-                <w:rFonts w:ascii="Times New Roman" w:eastAsiaTheme="minorEastAsia" w:hAnsi="Times New Roman" w:cs="Times New Roman"/>
-                <w:lang w:eastAsia="zh-CN"/>
-              </w:rPr>
-            </w:pPr>
-            <w:r>
-              <w:rPr>
-                <w:rFonts w:ascii="Times New Roman" w:eastAsiaTheme="minorEastAsia" w:hAnsi="Times New Roman" w:cs="Times New Roman"/>
-                <w:lang w:eastAsia="zh-CN"/>
-              </w:rPr>
-              <w:t>2. **The hypothesis should be closely related to the research topic**.</w:t>
-            </w:r>
-          </w:p>
-          <w:p>
-            <w:pPr>
-              <w:spacing w:after="0" w:line="240" w:lineRule="auto"/>
-              <w:rPr>
-                <w:rFonts w:ascii="Times New Roman" w:eastAsiaTheme="minorEastAsia" w:hAnsi="Times New Roman" w:cs="Times New Roman"/>
-                <w:lang w:eastAsia="zh-CN"/>
-              </w:rPr>
-            </w:pPr>
-            <w:r>
-              <w:rPr>
-                <w:rFonts w:ascii="Times New Roman" w:eastAsiaTheme="minorEastAsia" w:hAnsi="Times New Roman" w:cs="Times New Roman"/>
-                <w:lang w:eastAsia="zh-CN"/>
-              </w:rPr>
-              <w:t xml:space="preserve">3. **The hypothesis must be genuinely novel, not a predictable extension of the provided text**. </w:t>
-            </w:r>
-          </w:p>
-          <w:p>
-            <w:pPr>
-              <w:spacing w:after="0" w:line="240" w:lineRule="auto"/>
-              <w:rPr>
-                <w:rFonts w:ascii="Times New Roman" w:eastAsiaTheme="minorEastAsia" w:hAnsi="Times New Roman" w:cs="Times New Roman"/>
-                <w:lang w:eastAsia="zh-CN"/>
-              </w:rPr>
-            </w:pPr>
-            <w:r>
-              <w:rPr>
-                <w:rFonts w:ascii="Times New Roman" w:eastAsiaTheme="minorEastAsia" w:hAnsi="Times New Roman" w:cs="Times New Roman"/>
-                <w:lang w:eastAsia="zh-CN"/>
-              </w:rPr>
-              <w:t>4. **The hypothesis should be stated in a clear and concise manner**. Complex reasoning, multi-step causal pathways, or detailed theoretical justification should be placed in the Reasoning section, not embedded within the hypothesis itself.</w:t>
-            </w:r>
-          </w:p>
-          <w:p>
-            <w:pPr>
-              <w:spacing w:after="0" w:line="240" w:lineRule="auto"/>
-              <w:rPr>
-                <w:rFonts w:ascii="Times New Roman" w:eastAsiaTheme="minorEastAsia" w:hAnsi="Times New Roman" w:cs="Times New Roman"/>
-                <w:lang w:eastAsia="zh-CN"/>
-              </w:rPr>
-            </w:pPr>
-            <w:r>
-              <w:rPr>
-                <w:rFonts w:ascii="Times New Roman" w:eastAsiaTheme="minorEastAsia" w:hAnsi="Times New Roman" w:cs="Times New Roman"/>
-                <w:lang w:eastAsia="zh-CN"/>
-              </w:rPr>
-              <w:t>5. The hypothesis must be a **coherent and logically grounded conjecture**, not the aggregation of unrelated factors or inspirations.</w:t>
-            </w:r>
-          </w:p>
-          <w:p>
-            <w:pPr>
-              <w:spacing w:after="0" w:line="240" w:lineRule="auto"/>
-              <w:rPr>
-                <w:rFonts w:ascii="Times New Roman" w:eastAsiaTheme="minorEastAsia" w:hAnsi="Times New Roman" w:cs="Times New Roman"/>
-                <w:lang w:eastAsia="zh-CN"/>
-              </w:rPr>
-            </w:pPr>
-            <w:r>
-              <w:rPr>
-                <w:rFonts w:ascii="Times New Roman" w:eastAsiaTheme="minorEastAsia" w:hAnsi="Times New Roman" w:cs="Times New Roman"/>
-                <w:lang w:eastAsia="zh-CN"/>
-              </w:rPr>
-              <w:t>6. **Avoid creating overly complex or abstract hypotheses that cannot be empirically tested within reasonable experimental or observational frameworks**. Additionally, note that a hypothesis is not the same as an experimental design. Therefore, it should not attempt to specify concrete experimental procedures or numerical parameters. The pathway to verification or falsification should be clear, feasible, and should not rely on excessive or unverified assumptions.</w:t>
-            </w:r>
-          </w:p>
-          <w:p>
-            <w:pPr>
-              <w:spacing w:after="0" w:line="240" w:lineRule="auto"/>
-              <w:rPr>
-                <w:rFonts w:ascii="Times New Roman" w:eastAsiaTheme="minorEastAsia" w:hAnsi="Times New Roman" w:cs="Times New Roman"/>
-                <w:lang w:eastAsia="zh-CN"/>
-              </w:rPr>
-            </w:pPr>
-            <w:r>
-              <w:rPr>
-                <w:rFonts w:ascii="Times New Roman" w:eastAsiaTheme="minorEastAsia" w:hAnsi="Times New Roman" w:cs="Times New Roman"/>
-                <w:lang w:eastAsia="zh-CN"/>
-              </w:rPr>
-              <w:t>7. **When generating hypotheses, focus on major and direct ecological mechanisms rather than long and speculative causal chains. Avoid hypotheses that rely on multiple indirect steps or unlikely intermediary events to link cause and effect. A hypothesis should explain phenomena using the most direct and primary mechanism, not a complex chain of minor influences**.</w:t>
+              <w:t>phenomena using the most direct and primary mechanism, not a complex chain of minor influences**.</w:t>
             </w:r>
           </w:p>
           <w:p>
@@ -11322,6 +11312,7 @@
                 <w:rFonts w:ascii="Times New Roman" w:eastAsiaTheme="minorEastAsia" w:hAnsi="Times New Roman" w:cs="Times New Roman"/>
                 <w:lang w:eastAsia="zh-CN"/>
               </w:rPr>
+              <w:lastRenderedPageBreak/>
               <w:t>1. **Critical Synthesis**: Analyze the 'Current Hypothesis'. If there is</w:t>
             </w:r>
             <w:r>
@@ -11480,249 +11471,249 @@
                 <w:rFonts w:ascii="Times New Roman" w:eastAsiaTheme="minorEastAsia" w:hAnsi="Times New Roman" w:cs="Times New Roman"/>
                 <w:lang w:eastAsia="zh-CN"/>
               </w:rPr>
+              <w:t>5. The hypothesis must be a **coherent and logically grounded conjecture**, not the aggregation of unrelated factors or inspirations.</w:t>
+            </w:r>
+          </w:p>
+          <w:p>
+            <w:pPr>
+              <w:spacing w:after="0" w:line="240" w:lineRule="auto"/>
+              <w:rPr>
+                <w:rFonts w:ascii="Times New Roman" w:eastAsiaTheme="minorEastAsia" w:hAnsi="Times New Roman" w:cs="Times New Roman"/>
+                <w:lang w:eastAsia="zh-CN"/>
+              </w:rPr>
+            </w:pPr>
+            <w:r>
+              <w:rPr>
+                <w:rFonts w:ascii="Times New Roman" w:eastAsiaTheme="minorEastAsia" w:hAnsi="Times New Roman" w:cs="Times New Roman"/>
+                <w:lang w:eastAsia="zh-CN"/>
+              </w:rPr>
+              <w:t>6. **Avoid creating overly complex or abstract hypotheses that cannot be empirically tested within reasonable experimental or observational frameworks**. Additionally, note that a hypothesis is not the same as an experimental design. Therefore, it should not attempt to specify concrete experimental procedures or numerical parameters. The pathway to verification or falsification should be clear, feasible, and should not rely on excessive or unverified assumptions.</w:t>
+            </w:r>
+          </w:p>
+          <w:p>
+            <w:pPr>
+              <w:spacing w:after="0" w:line="240" w:lineRule="auto"/>
+              <w:rPr>
+                <w:rFonts w:ascii="Times New Roman" w:eastAsiaTheme="minorEastAsia" w:hAnsi="Times New Roman" w:cs="Times New Roman"/>
+                <w:lang w:eastAsia="zh-CN"/>
+              </w:rPr>
+            </w:pPr>
+            <w:r>
+              <w:rPr>
+                <w:rFonts w:ascii="Times New Roman" w:eastAsiaTheme="minorEastAsia" w:hAnsi="Times New Roman" w:cs="Times New Roman"/>
+                <w:lang w:eastAsia="zh-CN"/>
+              </w:rPr>
+              <w:t>7. **When generating hypotheses, focus on major and direct ecological mechanisms rather than long and speculative causal chains. Avoid hypotheses that rely on multiple indirect steps or unlikely intermediary events to link cause and effect. A hypothesis should explain phenomena using the most direct and primary mechanism, not a complex chain of minor influences**.</w:t>
+            </w:r>
+          </w:p>
+          <w:p>
+            <w:pPr>
+              <w:spacing w:after="0" w:line="240" w:lineRule="auto"/>
+              <w:rPr>
+                <w:rFonts w:ascii="Times New Roman" w:eastAsiaTheme="minorEastAsia" w:hAnsi="Times New Roman" w:cs="Times New Roman"/>
+                <w:lang w:eastAsia="zh-CN"/>
+              </w:rPr>
+            </w:pPr>
+            <w:r>
+              <w:rPr>
+                <w:rFonts w:ascii="Times New Roman" w:eastAsiaTheme="minorEastAsia" w:hAnsi="Times New Roman" w:cs="Times New Roman"/>
+                <w:lang w:eastAsia="zh-CN"/>
+              </w:rPr>
+              <w:t>8. **Ecological significance. The generated hypothesis must address a question of clear and broad importance to ecology or urban biodiversity**. Avoid hypotheses that are merely novel, plausible, or taxon-specific but have limited theoretical, empirical, or applied ecological significance. Hypotheses whose outcomes would not substantially advance ecological understanding or inform biodiversity management should be avoided.</w:t>
+            </w:r>
+          </w:p>
+          <w:p>
+            <w:pPr>
+              <w:spacing w:after="0" w:line="240" w:lineRule="auto"/>
+              <w:rPr>
+                <w:rFonts w:ascii="Times New Roman" w:eastAsiaTheme="minorEastAsia" w:hAnsi="Times New Roman" w:cs="Times New Roman"/>
+                <w:lang w:eastAsia="zh-CN"/>
+              </w:rPr>
+            </w:pPr>
+            <w:r>
+              <w:rPr>
+                <w:rFonts w:ascii="Times New Roman" w:eastAsiaTheme="minorEastAsia" w:hAnsi="Times New Roman" w:cs="Times New Roman"/>
+                <w:lang w:eastAsia="zh-CN"/>
+              </w:rPr>
+              <w:t>9. **Please ensure that each generated hypothesis is specific, clearly identifying the key ecological mechanisms, variables, and contexts involved, rather than remaining abstract or overly general**.</w:t>
+            </w:r>
+          </w:p>
+          <w:p>
+            <w:pPr>
+              <w:spacing w:after="0" w:line="240" w:lineRule="auto"/>
+              <w:rPr>
+                <w:rFonts w:ascii="Times New Roman" w:eastAsiaTheme="minorEastAsia" w:hAnsi="Times New Roman" w:cs="Times New Roman"/>
+                <w:lang w:eastAsia="zh-CN"/>
+              </w:rPr>
+            </w:pPr>
+            <w:r>
+              <w:rPr>
+                <w:rFonts w:ascii="Times New Roman" w:eastAsiaTheme="minorEastAsia" w:hAnsi="Times New Roman" w:cs="Times New Roman"/>
+                <w:lang w:eastAsia="zh-CN"/>
+              </w:rPr>
+              <w:t>10. **High-quality hypotheses do not exceed 50 words**.</w:t>
+            </w:r>
+          </w:p>
+          <w:p>
+            <w:pPr>
+              <w:spacing w:after="0" w:line="240" w:lineRule="auto"/>
+              <w:rPr>
+                <w:rFonts w:ascii="Times New Roman" w:eastAsiaTheme="minorEastAsia" w:hAnsi="Times New Roman" w:cs="Times New Roman"/>
+                <w:lang w:eastAsia="zh-CN"/>
+              </w:rPr>
+            </w:pPr>
+            <w:r>
+              <w:rPr>
+                <w:rFonts w:ascii="Times New Roman" w:eastAsiaTheme="minorEastAsia" w:hAnsi="Times New Roman" w:cs="Times New Roman"/>
+                <w:lang w:eastAsia="zh-CN"/>
+              </w:rPr>
+              <w:t>11. Pay attention on Critic's feedback and suggestions.</w:t>
+            </w:r>
+          </w:p>
+          <w:p>
+            <w:pPr>
+              <w:spacing w:after="0" w:line="240" w:lineRule="auto"/>
+              <w:rPr>
+                <w:rFonts w:ascii="Times New Roman" w:eastAsiaTheme="minorEastAsia" w:hAnsi="Times New Roman" w:cs="Times New Roman"/>
+                <w:lang w:eastAsia="zh-CN"/>
+              </w:rPr>
+            </w:pPr>
+          </w:p>
+          <w:p>
+            <w:pPr>
+              <w:spacing w:after="0" w:line="240" w:lineRule="auto"/>
+              <w:rPr>
+                <w:rFonts w:ascii="Times New Roman" w:eastAsiaTheme="minorEastAsia" w:hAnsi="Times New Roman" w:cs="Times New Roman"/>
+                <w:lang w:eastAsia="zh-CN"/>
+              </w:rPr>
+            </w:pPr>
+            <w:r>
+              <w:rPr>
+                <w:rFonts w:ascii="Times New Roman" w:eastAsiaTheme="minorEastAsia" w:hAnsi="Times New Roman" w:cs="Times New Roman"/>
+                <w:lang w:eastAsia="zh-CN"/>
+              </w:rPr>
+              <w:t>### Hypothesis Format</w:t>
+            </w:r>
+          </w:p>
+          <w:p>
+            <w:pPr>
+              <w:spacing w:after="0" w:line="240" w:lineRule="auto"/>
+              <w:rPr>
+                <w:rFonts w:ascii="Times New Roman" w:eastAsiaTheme="minorEastAsia" w:hAnsi="Times New Roman" w:cs="Times New Roman"/>
+                <w:lang w:eastAsia="zh-CN"/>
+              </w:rPr>
+            </w:pPr>
+            <w:r>
+              <w:rPr>
+                <w:rFonts w:ascii="Times New Roman" w:eastAsiaTheme="minorEastAsia" w:hAnsi="Times New Roman" w:cs="Times New Roman"/>
+                <w:lang w:eastAsia="zh-CN"/>
+              </w:rPr>
+              <w:t>The format of the hypothesis must be:</w:t>
+            </w:r>
+          </w:p>
+          <w:p>
+            <w:pPr>
+              <w:spacing w:after="0" w:line="240" w:lineRule="auto"/>
+              <w:rPr>
+                <w:rFonts w:ascii="Times New Roman" w:eastAsiaTheme="minorEastAsia" w:hAnsi="Times New Roman" w:cs="Times New Roman"/>
+                <w:lang w:eastAsia="zh-CN"/>
+              </w:rPr>
+            </w:pPr>
+            <w:r>
+              <w:rPr>
+                <w:rFonts w:ascii="Times New Roman" w:eastAsiaTheme="minorEastAsia" w:hAnsi="Times New Roman" w:cs="Times New Roman"/>
+                <w:lang w:eastAsia="zh-CN"/>
+              </w:rPr>
+              <w:t>'If [a specific change is made to the independent variable], then [a specific change will be observed in the dependent variable].'</w:t>
+            </w:r>
+          </w:p>
+          <w:p>
+            <w:pPr>
+              <w:spacing w:after="0" w:line="240" w:lineRule="auto"/>
+              <w:rPr>
+                <w:rFonts w:ascii="Times New Roman" w:eastAsiaTheme="minorEastAsia" w:hAnsi="Times New Roman" w:cs="Times New Roman"/>
+                <w:lang w:eastAsia="zh-CN"/>
+              </w:rPr>
+            </w:pPr>
+          </w:p>
+          <w:p>
+            <w:pPr>
+              <w:spacing w:after="0" w:line="240" w:lineRule="auto"/>
+              <w:rPr>
+                <w:rFonts w:ascii="Times New Roman" w:eastAsiaTheme="minorEastAsia" w:hAnsi="Times New Roman" w:cs="Times New Roman"/>
+                <w:lang w:eastAsia="zh-CN"/>
+              </w:rPr>
+            </w:pPr>
+            <w:r>
+              <w:rPr>
+                <w:rFonts w:ascii="Times New Roman" w:eastAsiaTheme="minorEastAsia" w:hAnsi="Times New Roman" w:cs="Times New Roman"/>
+                <w:lang w:eastAsia="zh-CN"/>
+              </w:rPr>
+              <w:t>### Output Format</w:t>
+            </w:r>
+          </w:p>
+          <w:p>
+            <w:pPr>
+              <w:spacing w:after="0" w:line="240" w:lineRule="auto"/>
+              <w:rPr>
+                <w:rFonts w:ascii="Times New Roman" w:eastAsiaTheme="minorEastAsia" w:hAnsi="Times New Roman" w:cs="Times New Roman"/>
+                <w:lang w:eastAsia="zh-CN"/>
+              </w:rPr>
+            </w:pPr>
+            <w:r>
+              <w:rPr>
+                <w:rFonts w:ascii="Times New Roman" w:eastAsiaTheme="minorEastAsia" w:hAnsi="Times New Roman" w:cs="Times New Roman"/>
+                <w:lang w:eastAsia="zh-CN"/>
+              </w:rPr>
+              <w:t>**Strict Output**: Your response needs to follow this strict format, do not include any other text outside the JSON block.</w:t>
+            </w:r>
+          </w:p>
+          <w:p>
+            <w:pPr>
+              <w:spacing w:after="0" w:line="240" w:lineRule="auto"/>
+              <w:rPr>
+                <w:rFonts w:ascii="Times New Roman" w:eastAsiaTheme="minorEastAsia" w:hAnsi="Times New Roman" w:cs="Times New Roman"/>
+                <w:lang w:eastAsia="zh-CN"/>
+              </w:rPr>
+            </w:pPr>
+            <w:r>
+              <w:rPr>
+                <w:rFonts w:ascii="Times New Roman" w:eastAsiaTheme="minorEastAsia" w:hAnsi="Times New Roman" w:cs="Times New Roman"/>
+                <w:lang w:eastAsia="zh-CN"/>
+              </w:rPr>
+              <w:t>Output only **one** refined hypothesis. The JSON format for the Refined Hypothesis should strictly be:</w:t>
+            </w:r>
+          </w:p>
+          <w:p>
+            <w:pPr>
+              <w:spacing w:after="0" w:line="240" w:lineRule="auto"/>
+              <w:rPr>
+                <w:rFonts w:ascii="Times New Roman" w:eastAsiaTheme="minorEastAsia" w:hAnsi="Times New Roman" w:cs="Times New Roman"/>
+                <w:lang w:eastAsia="zh-CN"/>
+              </w:rPr>
+            </w:pPr>
+            <w:r>
+              <w:rPr>
+                <w:rFonts w:ascii="Times New Roman" w:eastAsiaTheme="minorEastAsia" w:hAnsi="Times New Roman" w:cs="Times New Roman"/>
+                <w:lang w:eastAsia="zh-CN"/>
+              </w:rPr>
+              <w:t>{{</w:t>
+            </w:r>
+          </w:p>
+          <w:p>
+            <w:pPr>
+              <w:spacing w:after="0" w:line="240" w:lineRule="auto"/>
+              <w:rPr>
+                <w:rFonts w:ascii="Times New Roman" w:eastAsiaTheme="minorEastAsia" w:hAnsi="Times New Roman" w:cs="Times New Roman"/>
+                <w:lang w:eastAsia="zh-CN"/>
+              </w:rPr>
+            </w:pPr>
+            <w:r>
+              <w:rPr>
+                <w:rFonts w:ascii="Times New Roman" w:eastAsiaTheme="minorEastAsia" w:hAnsi="Times New Roman" w:cs="Times New Roman"/>
+                <w:lang w:eastAsia="zh-CN"/>
+              </w:rPr>
               <w:lastRenderedPageBreak/>
-              <w:t>5. The hypothesis must be a **coherent and logically grounded conjecture**, not the aggregation of unrelated factors or inspirations.</w:t>
-            </w:r>
-          </w:p>
-          <w:p>
-            <w:pPr>
-              <w:spacing w:after="0" w:line="240" w:lineRule="auto"/>
-              <w:rPr>
-                <w:rFonts w:ascii="Times New Roman" w:eastAsiaTheme="minorEastAsia" w:hAnsi="Times New Roman" w:cs="Times New Roman"/>
-                <w:lang w:eastAsia="zh-CN"/>
-              </w:rPr>
-            </w:pPr>
-            <w:r>
-              <w:rPr>
-                <w:rFonts w:ascii="Times New Roman" w:eastAsiaTheme="minorEastAsia" w:hAnsi="Times New Roman" w:cs="Times New Roman"/>
-                <w:lang w:eastAsia="zh-CN"/>
-              </w:rPr>
-              <w:t>6. **Avoid creating overly complex or abstract hypotheses that cannot be empirically tested within reasonable experimental or observational frameworks**. Additionally, note that a hypothesis is not the same as an experimental design. Therefore, it should not attempt to specify concrete experimental procedures or numerical parameters. The pathway to verification or falsification should be clear, feasible, and should not rely on excessive or unverified assumptions.</w:t>
-            </w:r>
-          </w:p>
-          <w:p>
-            <w:pPr>
-              <w:spacing w:after="0" w:line="240" w:lineRule="auto"/>
-              <w:rPr>
-                <w:rFonts w:ascii="Times New Roman" w:eastAsiaTheme="minorEastAsia" w:hAnsi="Times New Roman" w:cs="Times New Roman"/>
-                <w:lang w:eastAsia="zh-CN"/>
-              </w:rPr>
-            </w:pPr>
-            <w:r>
-              <w:rPr>
-                <w:rFonts w:ascii="Times New Roman" w:eastAsiaTheme="minorEastAsia" w:hAnsi="Times New Roman" w:cs="Times New Roman"/>
-                <w:lang w:eastAsia="zh-CN"/>
-              </w:rPr>
-              <w:t>7. **When generating hypotheses, focus on major and direct ecological mechanisms rather than long and speculative causal chains. Avoid hypotheses that rely on multiple indirect steps or unlikely intermediary events to link cause and effect. A hypothesis should explain phenomena using the most direct and primary mechanism, not a complex chain of minor influences**.</w:t>
-            </w:r>
-          </w:p>
-          <w:p>
-            <w:pPr>
-              <w:spacing w:after="0" w:line="240" w:lineRule="auto"/>
-              <w:rPr>
-                <w:rFonts w:ascii="Times New Roman" w:eastAsiaTheme="minorEastAsia" w:hAnsi="Times New Roman" w:cs="Times New Roman"/>
-                <w:lang w:eastAsia="zh-CN"/>
-              </w:rPr>
-            </w:pPr>
-            <w:r>
-              <w:rPr>
-                <w:rFonts w:ascii="Times New Roman" w:eastAsiaTheme="minorEastAsia" w:hAnsi="Times New Roman" w:cs="Times New Roman"/>
-                <w:lang w:eastAsia="zh-CN"/>
-              </w:rPr>
-              <w:t>8. **Ecological significance. The generated hypothesis must address a question of clear and broad importance to ecology or urban biodiversity**. Avoid hypotheses that are merely novel, plausible, or taxon-specific but have limited theoretical, empirical, or applied ecological significance. Hypotheses whose outcomes would not substantially advance ecological understanding or inform biodiversity management should be avoided.</w:t>
-            </w:r>
-          </w:p>
-          <w:p>
-            <w:pPr>
-              <w:spacing w:after="0" w:line="240" w:lineRule="auto"/>
-              <w:rPr>
-                <w:rFonts w:ascii="Times New Roman" w:eastAsiaTheme="minorEastAsia" w:hAnsi="Times New Roman" w:cs="Times New Roman"/>
-                <w:lang w:eastAsia="zh-CN"/>
-              </w:rPr>
-            </w:pPr>
-            <w:r>
-              <w:rPr>
-                <w:rFonts w:ascii="Times New Roman" w:eastAsiaTheme="minorEastAsia" w:hAnsi="Times New Roman" w:cs="Times New Roman"/>
-                <w:lang w:eastAsia="zh-CN"/>
-              </w:rPr>
-              <w:t>9. **Please ensure that each generated hypothesis is specific, clearly identifying the key ecological mechanisms, variables, and contexts involved, rather than remaining abstract or overly general**.</w:t>
-            </w:r>
-          </w:p>
-          <w:p>
-            <w:pPr>
-              <w:spacing w:after="0" w:line="240" w:lineRule="auto"/>
-              <w:rPr>
-                <w:rFonts w:ascii="Times New Roman" w:eastAsiaTheme="minorEastAsia" w:hAnsi="Times New Roman" w:cs="Times New Roman"/>
-                <w:lang w:eastAsia="zh-CN"/>
-              </w:rPr>
-            </w:pPr>
-            <w:r>
-              <w:rPr>
-                <w:rFonts w:ascii="Times New Roman" w:eastAsiaTheme="minorEastAsia" w:hAnsi="Times New Roman" w:cs="Times New Roman"/>
-                <w:lang w:eastAsia="zh-CN"/>
-              </w:rPr>
-              <w:t>10. **High-quality hypotheses do not exceed 50 words**.</w:t>
-            </w:r>
-          </w:p>
-          <w:p>
-            <w:pPr>
-              <w:spacing w:after="0" w:line="240" w:lineRule="auto"/>
-              <w:rPr>
-                <w:rFonts w:ascii="Times New Roman" w:eastAsiaTheme="minorEastAsia" w:hAnsi="Times New Roman" w:cs="Times New Roman"/>
-                <w:lang w:eastAsia="zh-CN"/>
-              </w:rPr>
-            </w:pPr>
-            <w:r>
-              <w:rPr>
-                <w:rFonts w:ascii="Times New Roman" w:eastAsiaTheme="minorEastAsia" w:hAnsi="Times New Roman" w:cs="Times New Roman"/>
-                <w:lang w:eastAsia="zh-CN"/>
-              </w:rPr>
-              <w:t>11. Pay attention on Critic's feedback and suggestions.</w:t>
-            </w:r>
-          </w:p>
-          <w:p>
-            <w:pPr>
-              <w:spacing w:after="0" w:line="240" w:lineRule="auto"/>
-              <w:rPr>
-                <w:rFonts w:ascii="Times New Roman" w:eastAsiaTheme="minorEastAsia" w:hAnsi="Times New Roman" w:cs="Times New Roman"/>
-                <w:lang w:eastAsia="zh-CN"/>
-              </w:rPr>
-            </w:pPr>
-          </w:p>
-          <w:p>
-            <w:pPr>
-              <w:spacing w:after="0" w:line="240" w:lineRule="auto"/>
-              <w:rPr>
-                <w:rFonts w:ascii="Times New Roman" w:eastAsiaTheme="minorEastAsia" w:hAnsi="Times New Roman" w:cs="Times New Roman"/>
-                <w:lang w:eastAsia="zh-CN"/>
-              </w:rPr>
-            </w:pPr>
-            <w:r>
-              <w:rPr>
-                <w:rFonts w:ascii="Times New Roman" w:eastAsiaTheme="minorEastAsia" w:hAnsi="Times New Roman" w:cs="Times New Roman"/>
-                <w:lang w:eastAsia="zh-CN"/>
-              </w:rPr>
-              <w:t>### Hypothesis Format</w:t>
-            </w:r>
-          </w:p>
-          <w:p>
-            <w:pPr>
-              <w:spacing w:after="0" w:line="240" w:lineRule="auto"/>
-              <w:rPr>
-                <w:rFonts w:ascii="Times New Roman" w:eastAsiaTheme="minorEastAsia" w:hAnsi="Times New Roman" w:cs="Times New Roman"/>
-                <w:lang w:eastAsia="zh-CN"/>
-              </w:rPr>
-            </w:pPr>
-            <w:r>
-              <w:rPr>
-                <w:rFonts w:ascii="Times New Roman" w:eastAsiaTheme="minorEastAsia" w:hAnsi="Times New Roman" w:cs="Times New Roman"/>
-                <w:lang w:eastAsia="zh-CN"/>
-              </w:rPr>
-              <w:t>The format of the hypothesis must be:</w:t>
-            </w:r>
-          </w:p>
-          <w:p>
-            <w:pPr>
-              <w:spacing w:after="0" w:line="240" w:lineRule="auto"/>
-              <w:rPr>
-                <w:rFonts w:ascii="Times New Roman" w:eastAsiaTheme="minorEastAsia" w:hAnsi="Times New Roman" w:cs="Times New Roman"/>
-                <w:lang w:eastAsia="zh-CN"/>
-              </w:rPr>
-            </w:pPr>
-            <w:r>
-              <w:rPr>
-                <w:rFonts w:ascii="Times New Roman" w:eastAsiaTheme="minorEastAsia" w:hAnsi="Times New Roman" w:cs="Times New Roman"/>
-                <w:lang w:eastAsia="zh-CN"/>
-              </w:rPr>
-              <w:t>'If [a specific change is made to the independent variable], then [a specific change will be observed in the dependent variable].'</w:t>
-            </w:r>
-          </w:p>
-          <w:p>
-            <w:pPr>
-              <w:spacing w:after="0" w:line="240" w:lineRule="auto"/>
-              <w:rPr>
-                <w:rFonts w:ascii="Times New Roman" w:eastAsiaTheme="minorEastAsia" w:hAnsi="Times New Roman" w:cs="Times New Roman"/>
-                <w:lang w:eastAsia="zh-CN"/>
-              </w:rPr>
-            </w:pPr>
-          </w:p>
-          <w:p>
-            <w:pPr>
-              <w:spacing w:after="0" w:line="240" w:lineRule="auto"/>
-              <w:rPr>
-                <w:rFonts w:ascii="Times New Roman" w:eastAsiaTheme="minorEastAsia" w:hAnsi="Times New Roman" w:cs="Times New Roman"/>
-                <w:lang w:eastAsia="zh-CN"/>
-              </w:rPr>
-            </w:pPr>
-            <w:r>
-              <w:rPr>
-                <w:rFonts w:ascii="Times New Roman" w:eastAsiaTheme="minorEastAsia" w:hAnsi="Times New Roman" w:cs="Times New Roman"/>
-                <w:lang w:eastAsia="zh-CN"/>
-              </w:rPr>
-              <w:t>### Output Format</w:t>
-            </w:r>
-          </w:p>
-          <w:p>
-            <w:pPr>
-              <w:spacing w:after="0" w:line="240" w:lineRule="auto"/>
-              <w:rPr>
-                <w:rFonts w:ascii="Times New Roman" w:eastAsiaTheme="minorEastAsia" w:hAnsi="Times New Roman" w:cs="Times New Roman"/>
-                <w:lang w:eastAsia="zh-CN"/>
-              </w:rPr>
-            </w:pPr>
-            <w:r>
-              <w:rPr>
-                <w:rFonts w:ascii="Times New Roman" w:eastAsiaTheme="minorEastAsia" w:hAnsi="Times New Roman" w:cs="Times New Roman"/>
-                <w:lang w:eastAsia="zh-CN"/>
-              </w:rPr>
-              <w:t>**Strict Output**: Your response needs to follow this strict format, do not include any other text outside the JSON block.</w:t>
-            </w:r>
-          </w:p>
-          <w:p>
-            <w:pPr>
-              <w:spacing w:after="0" w:line="240" w:lineRule="auto"/>
-              <w:rPr>
-                <w:rFonts w:ascii="Times New Roman" w:eastAsiaTheme="minorEastAsia" w:hAnsi="Times New Roman" w:cs="Times New Roman"/>
-                <w:lang w:eastAsia="zh-CN"/>
-              </w:rPr>
-            </w:pPr>
-            <w:r>
-              <w:rPr>
-                <w:rFonts w:ascii="Times New Roman" w:eastAsiaTheme="minorEastAsia" w:hAnsi="Times New Roman" w:cs="Times New Roman"/>
-                <w:lang w:eastAsia="zh-CN"/>
-              </w:rPr>
-              <w:t>Output only **one** refined hypothesis. The JSON format for the Refined Hypothesis should strictly be:</w:t>
-            </w:r>
-          </w:p>
-          <w:p>
-            <w:pPr>
-              <w:spacing w:after="0" w:line="240" w:lineRule="auto"/>
-              <w:rPr>
-                <w:rFonts w:ascii="Times New Roman" w:eastAsiaTheme="minorEastAsia" w:hAnsi="Times New Roman" w:cs="Times New Roman"/>
-                <w:lang w:eastAsia="zh-CN"/>
-              </w:rPr>
-            </w:pPr>
-            <w:r>
-              <w:rPr>
-                <w:rFonts w:ascii="Times New Roman" w:eastAsiaTheme="minorEastAsia" w:hAnsi="Times New Roman" w:cs="Times New Roman"/>
-                <w:lang w:eastAsia="zh-CN"/>
-              </w:rPr>
-              <w:t>{{</w:t>
-            </w:r>
-          </w:p>
-          <w:p>
-            <w:pPr>
-              <w:spacing w:after="0" w:line="240" w:lineRule="auto"/>
-              <w:rPr>
-                <w:rFonts w:ascii="Times New Roman" w:eastAsiaTheme="minorEastAsia" w:hAnsi="Times New Roman" w:cs="Times New Roman"/>
-                <w:lang w:eastAsia="zh-CN"/>
-              </w:rPr>
-            </w:pPr>
-            <w:r>
-              <w:rPr>
-                <w:rFonts w:ascii="Times New Roman" w:eastAsiaTheme="minorEastAsia" w:hAnsi="Times New Roman" w:cs="Times New Roman"/>
-                <w:lang w:eastAsia="zh-CN"/>
-              </w:rPr>
               <w:t>"ID": "Unique ID for the hypothesis",</w:t>
             </w:r>
           </w:p>
@@ -11825,7 +11816,7 @@
         <w:pStyle w:val="SupplementaryCaption"/>
         <w:keepNext/>
         <w:rPr>
-          <w:rFonts w:ascii="Times New Roman" w:eastAsiaTheme="minorEastAsia" w:hAnsi="Times New Roman" w:cs="Times New Roman" w:hint="eastAsia"/>
+          <w:rFonts w:ascii="Times New Roman" w:eastAsiaTheme="minorEastAsia" w:hAnsi="Times New Roman" w:cs="Times New Roman"/>
           <w:lang w:eastAsia="zh-CN"/>
         </w:rPr>
       </w:pPr>
@@ -11834,7 +11825,6 @@
           <w:rFonts w:ascii="Times New Roman" w:hAnsi="Times New Roman" w:cs="Times New Roman"/>
           <w:b/>
         </w:rPr>
-        <w:lastRenderedPageBreak/>
         <w:t xml:space="preserve">Supplementary Table </w:t>
       </w:r>
       <w:r>
@@ -12524,6 +12514,7 @@
                 <w:rFonts w:ascii="Times New Roman" w:eastAsiaTheme="minorEastAsia" w:hAnsi="Times New Roman" w:cs="Times New Roman"/>
                 <w:lang w:eastAsia="zh-CN"/>
               </w:rPr>
+              <w:lastRenderedPageBreak/>
               <w:t xml:space="preserve"> "[Exact quoted text]"</w:t>
             </w:r>
           </w:p>
@@ -12540,7 +12531,6 @@
                 <w:rFonts w:ascii="Times New Roman" w:eastAsiaTheme="minorEastAsia" w:hAnsi="Times New Roman" w:cs="Times New Roman"/>
                 <w:lang w:eastAsia="zh-CN"/>
               </w:rPr>
-              <w:lastRenderedPageBreak/>
               <w:t>- Source location:</w:t>
             </w:r>
           </w:p>
@@ -12875,7 +12865,7 @@
     <w:p>
       <w:pPr>
         <w:rPr>
-          <w:rFonts w:ascii="Times New Roman" w:eastAsiaTheme="minorEastAsia" w:hAnsi="Times New Roman" w:cs="Times New Roman" w:hint="eastAsia"/>
+          <w:rFonts w:ascii="Times New Roman" w:eastAsiaTheme="minorEastAsia" w:hAnsi="Times New Roman" w:cs="Times New Roman"/>
           <w:bCs/>
           <w:sz w:val="40"/>
           <w:szCs w:val="21"/>
@@ -12887,13 +12877,43 @@
       <w:pPr>
         <w:pStyle w:val="1"/>
         <w:rPr>
+          <w:rFonts w:ascii="Times New Roman" w:eastAsiaTheme="minorEastAsia" w:hAnsi="Times New Roman" w:cs="Times New Roman"/>
+          <w:b/>
+          <w:color w:val="000000" w:themeColor="text1"/>
+          <w:sz w:val="24"/>
+          <w:szCs w:val="24"/>
+        </w:rPr>
+      </w:pPr>
+      <w:r>
+        <w:rPr>
+          <w:rFonts w:ascii="Times New Roman" w:eastAsia="Arial" w:hAnsi="Times New Roman" w:cs="Times New Roman"/>
+          <w:b/>
+          <w:color w:val="000000" w:themeColor="text1"/>
+          <w:sz w:val="24"/>
+          <w:szCs w:val="24"/>
+        </w:rPr>
+        <w:t xml:space="preserve">Supplementary Note </w:t>
+      </w:r>
+      <w:r>
+        <w:rPr>
           <w:rFonts w:ascii="Times New Roman" w:eastAsiaTheme="minorEastAsia" w:hAnsi="Times New Roman" w:cs="Times New Roman" w:hint="eastAsia"/>
           <w:b/>
           <w:color w:val="000000" w:themeColor="text1"/>
           <w:sz w:val="24"/>
           <w:szCs w:val="24"/>
         </w:rPr>
-      </w:pPr>
+        <w:t>3</w:t>
+      </w:r>
+      <w:r>
+        <w:rPr>
+          <w:rFonts w:ascii="Times New Roman" w:eastAsiaTheme="minorEastAsia" w:hAnsi="Times New Roman" w:cs="Times New Roman" w:hint="eastAsia"/>
+          <w:b/>
+          <w:color w:val="000000" w:themeColor="text1"/>
+          <w:sz w:val="24"/>
+          <w:szCs w:val="24"/>
+        </w:rPr>
+        <w:t xml:space="preserve"> </w:t>
+      </w:r>
       <w:r>
         <w:rPr>
           <w:rFonts w:ascii="Times New Roman" w:eastAsia="Arial" w:hAnsi="Times New Roman" w:cs="Times New Roman"/>
@@ -12902,7 +12922,17 @@
           <w:sz w:val="24"/>
           <w:szCs w:val="24"/>
         </w:rPr>
-        <w:t xml:space="preserve">Supplementary Note </w:t>
+        <w:t xml:space="preserve">| </w:t>
+      </w:r>
+      <w:r>
+        <w:rPr>
+          <w:rFonts w:ascii="Times New Roman" w:eastAsiaTheme="minorEastAsia" w:hAnsi="Times New Roman" w:cs="Times New Roman"/>
+          <w:b/>
+          <w:color w:val="000000" w:themeColor="text1"/>
+          <w:sz w:val="24"/>
+          <w:szCs w:val="24"/>
+        </w:rPr>
+        <w:t>Forty</w:t>
       </w:r>
       <w:r>
         <w:rPr>
@@ -12912,17 +12942,7 @@
           <w:sz w:val="24"/>
           <w:szCs w:val="24"/>
         </w:rPr>
-        <w:t>3</w:t>
-      </w:r>
-      <w:r>
-        <w:rPr>
-          <w:rFonts w:ascii="Times New Roman" w:eastAsiaTheme="minorEastAsia" w:hAnsi="Times New Roman" w:cs="Times New Roman" w:hint="eastAsia"/>
-          <w:b/>
-          <w:color w:val="000000" w:themeColor="text1"/>
-          <w:sz w:val="24"/>
-          <w:szCs w:val="24"/>
-        </w:rPr>
-        <w:t xml:space="preserve"> </w:t>
+        <w:t>-five</w:t>
       </w:r>
       <w:r>
         <w:rPr>
@@ -12932,43 +12952,13 @@
           <w:sz w:val="24"/>
           <w:szCs w:val="24"/>
         </w:rPr>
-        <w:t xml:space="preserve">| </w:t>
-      </w:r>
-      <w:r>
-        <w:rPr>
-          <w:rFonts w:ascii="Times New Roman" w:eastAsiaTheme="minorEastAsia" w:hAnsi="Times New Roman" w:cs="Times New Roman"/>
-          <w:b/>
-          <w:color w:val="000000" w:themeColor="text1"/>
-          <w:sz w:val="24"/>
-          <w:szCs w:val="24"/>
-        </w:rPr>
-        <w:t>Forty</w:t>
-      </w:r>
-      <w:r>
-        <w:rPr>
-          <w:rFonts w:ascii="Times New Roman" w:eastAsiaTheme="minorEastAsia" w:hAnsi="Times New Roman" w:cs="Times New Roman" w:hint="eastAsia"/>
-          <w:b/>
-          <w:color w:val="000000" w:themeColor="text1"/>
-          <w:sz w:val="24"/>
-          <w:szCs w:val="24"/>
-        </w:rPr>
-        <w:t>-five</w:t>
-      </w:r>
-      <w:r>
-        <w:rPr>
-          <w:rFonts w:ascii="Times New Roman" w:eastAsia="Arial" w:hAnsi="Times New Roman" w:cs="Times New Roman"/>
-          <w:b/>
-          <w:color w:val="000000" w:themeColor="text1"/>
-          <w:sz w:val="24"/>
-          <w:szCs w:val="24"/>
-        </w:rPr>
         <w:t xml:space="preserve"> LLM-generated hypotheses and 45 human-proposed hypotheses</w:t>
       </w:r>
     </w:p>
     <w:p>
       <w:pPr>
         <w:rPr>
-          <w:rFonts w:ascii="Times New Roman" w:eastAsiaTheme="minorEastAsia" w:hAnsi="Times New Roman" w:cs="Times New Roman" w:hint="eastAsia"/>
+          <w:rFonts w:ascii="Times New Roman" w:eastAsiaTheme="minorEastAsia" w:hAnsi="Times New Roman" w:cs="Times New Roman"/>
           <w:b/>
           <w:bCs/>
           <w:lang w:eastAsia="zh-CN"/>
@@ -13009,6 +12999,7 @@
           <w:ilvl w:val="0"/>
           <w:numId w:val="2"/>
         </w:numPr>
+        <w:jc w:val="both"/>
         <w:rPr>
           <w:rFonts w:ascii="Times New Roman" w:hAnsi="Times New Roman" w:cs="Times New Roman"/>
         </w:rPr>
@@ -13027,6 +13018,7 @@
           <w:ilvl w:val="0"/>
           <w:numId w:val="2"/>
         </w:numPr>
+        <w:jc w:val="both"/>
         <w:rPr>
           <w:rFonts w:ascii="Times New Roman" w:hAnsi="Times New Roman" w:cs="Times New Roman"/>
         </w:rPr>
@@ -13035,14 +13027,7 @@
         <w:rPr>
           <w:rFonts w:ascii="Times New Roman" w:hAnsi="Times New Roman" w:cs="Times New Roman"/>
         </w:rPr>
-        <w:t>If the foliage-density-to-twig ratio of urban tree canopies is increased, then the species richness of foliage-gleaning insectivores will increase disproportionately more in non-</w:t>
-      </w:r>
-      <w:r>
-        <w:rPr>
-          <w:rFonts w:ascii="Times New Roman" w:hAnsi="Times New Roman" w:cs="Times New Roman"/>
-        </w:rPr>
-        <w:lastRenderedPageBreak/>
-        <w:t>native trees than in native trees.</w:t>
+        <w:t>If the foliage-density-to-twig ratio of urban tree canopies is increased, then the species richness of foliage-gleaning insectivores will increase disproportionately more in non-native trees than in native trees.</w:t>
       </w:r>
     </w:p>
     <w:p>
@@ -13052,6 +13037,7 @@
           <w:ilvl w:val="0"/>
           <w:numId w:val="2"/>
         </w:numPr>
+        <w:jc w:val="both"/>
         <w:rPr>
           <w:rFonts w:ascii="Times New Roman" w:hAnsi="Times New Roman" w:cs="Times New Roman"/>
         </w:rPr>
@@ -13060,7 +13046,14 @@
         <w:rPr>
           <w:rFonts w:ascii="Times New Roman" w:hAnsi="Times New Roman" w:cs="Times New Roman"/>
         </w:rPr>
-        <w:t>If the 3D canopy connectivity increases such that the mean inter-patch distance falls below a critical gap-crossing threshold, then the colonization success of forest-specialist birds within high-density urban cores will increase non-linearly as the matrix transitions to functional permeability.</w:t>
+        <w:t xml:space="preserve">If the 3D canopy connectivity increases such that the mean inter-patch distance falls below a critical gap-crossing threshold, then the colonization success of forest-specialist birds within high-density urban cores will increase non-linearly as the matrix transitions to functional </w:t>
+      </w:r>
+      <w:r>
+        <w:rPr>
+          <w:rFonts w:ascii="Times New Roman" w:hAnsi="Times New Roman" w:cs="Times New Roman"/>
+        </w:rPr>
+        <w:lastRenderedPageBreak/>
+        <w:t>permeability.</w:t>
       </w:r>
     </w:p>
     <w:p>
@@ -13070,6 +13063,7 @@
           <w:ilvl w:val="0"/>
           <w:numId w:val="2"/>
         </w:numPr>
+        <w:jc w:val="both"/>
         <w:rPr>
           <w:rFonts w:ascii="Times New Roman" w:hAnsi="Times New Roman" w:cs="Times New Roman"/>
         </w:rPr>
@@ -13088,6 +13082,7 @@
           <w:ilvl w:val="0"/>
           <w:numId w:val="2"/>
         </w:numPr>
+        <w:jc w:val="both"/>
         <w:rPr>
           <w:rFonts w:ascii="Times New Roman" w:hAnsi="Times New Roman" w:cs="Times New Roman"/>
         </w:rPr>
@@ -13106,6 +13101,7 @@
           <w:ilvl w:val="0"/>
           <w:numId w:val="2"/>
         </w:numPr>
+        <w:jc w:val="both"/>
         <w:rPr>
           <w:rFonts w:ascii="Times New Roman" w:hAnsi="Times New Roman" w:cs="Times New Roman"/>
         </w:rPr>
@@ -13124,6 +13120,7 @@
           <w:ilvl w:val="0"/>
           <w:numId w:val="2"/>
         </w:numPr>
+        <w:jc w:val="both"/>
         <w:rPr>
           <w:rFonts w:ascii="Times New Roman" w:hAnsi="Times New Roman" w:cs="Times New Roman"/>
         </w:rPr>
@@ -13156,6 +13153,7 @@
           <w:ilvl w:val="0"/>
           <w:numId w:val="2"/>
         </w:numPr>
+        <w:jc w:val="both"/>
         <w:rPr>
           <w:rFonts w:ascii="Times New Roman" w:hAnsi="Times New Roman" w:cs="Times New Roman"/>
         </w:rPr>
@@ -13174,6 +13172,7 @@
           <w:ilvl w:val="0"/>
           <w:numId w:val="2"/>
         </w:numPr>
+        <w:jc w:val="both"/>
         <w:rPr>
           <w:rFonts w:ascii="Times New Roman" w:hAnsi="Times New Roman" w:cs="Times New Roman"/>
         </w:rPr>
@@ -13192,6 +13191,7 @@
           <w:ilvl w:val="0"/>
           <w:numId w:val="2"/>
         </w:numPr>
+        <w:jc w:val="both"/>
         <w:rPr>
           <w:rFonts w:ascii="Times New Roman" w:hAnsi="Times New Roman" w:cs="Times New Roman"/>
         </w:rPr>
@@ -13210,6 +13210,7 @@
           <w:ilvl w:val="0"/>
           <w:numId w:val="2"/>
         </w:numPr>
+        <w:jc w:val="both"/>
         <w:rPr>
           <w:rFonts w:ascii="Times New Roman" w:hAnsi="Times New Roman" w:cs="Times New Roman"/>
         </w:rPr>
@@ -13228,6 +13229,7 @@
           <w:ilvl w:val="0"/>
           <w:numId w:val="2"/>
         </w:numPr>
+        <w:jc w:val="both"/>
         <w:rPr>
           <w:rFonts w:ascii="Times New Roman" w:hAnsi="Times New Roman" w:cs="Times New Roman"/>
         </w:rPr>
@@ -13246,6 +13248,7 @@
           <w:ilvl w:val="0"/>
           <w:numId w:val="2"/>
         </w:numPr>
+        <w:jc w:val="both"/>
         <w:rPr>
           <w:rFonts w:ascii="Times New Roman" w:hAnsi="Times New Roman" w:cs="Times New Roman"/>
         </w:rPr>
@@ -13254,7 +13257,6 @@
         <w:rPr>
           <w:rFonts w:ascii="Times New Roman" w:hAnsi="Times New Roman" w:cs="Times New Roman"/>
         </w:rPr>
-        <w:lastRenderedPageBreak/>
         <w:t>If anthropogenic food subsidies are transitioned from clustered point-sources to a spatial distribution exceeding the mean territory radius of dominant resident synanthropes, then the seasonal turnover of migratory dietary specialists will increase as the cost of defense dilutes their interspecific social exclusion.</w:t>
       </w:r>
     </w:p>
@@ -13265,6 +13267,7 @@
           <w:ilvl w:val="0"/>
           <w:numId w:val="2"/>
         </w:numPr>
+        <w:jc w:val="both"/>
         <w:rPr>
           <w:rFonts w:ascii="Times New Roman" w:hAnsi="Times New Roman" w:cs="Times New Roman"/>
         </w:rPr>
@@ -13283,6 +13286,7 @@
           <w:ilvl w:val="0"/>
           <w:numId w:val="2"/>
         </w:numPr>
+        <w:jc w:val="both"/>
         <w:rPr>
           <w:rFonts w:ascii="Times New Roman" w:hAnsi="Times New Roman" w:cs="Times New Roman"/>
         </w:rPr>
@@ -13301,6 +13305,7 @@
           <w:ilvl w:val="0"/>
           <w:numId w:val="2"/>
         </w:numPr>
+        <w:jc w:val="both"/>
         <w:rPr>
           <w:rFonts w:ascii="Times New Roman" w:hAnsi="Times New Roman" w:cs="Times New Roman"/>
         </w:rPr>
@@ -13309,7 +13314,14 @@
         <w:rPr>
           <w:rFonts w:ascii="Times New Roman" w:hAnsi="Times New Roman" w:cs="Times New Roman"/>
         </w:rPr>
-        <w:t>If dietary polyphenol availability is increased concurrently with the restoration of natural dark-light cycles, then the amplified rhythmic production of microbial indole derivatives will restore intestinal immune homeostasis, significantly increasing the fledgling survival rates of urban-nesting birds.</w:t>
+        <w:t>If dietary polyphenol availability is increased concurrently with the restoration of natural dark-</w:t>
+      </w:r>
+      <w:r>
+        <w:rPr>
+          <w:rFonts w:ascii="Times New Roman" w:hAnsi="Times New Roman" w:cs="Times New Roman"/>
+        </w:rPr>
+        <w:lastRenderedPageBreak/>
+        <w:t>light cycles, then the amplified rhythmic production of microbial indole derivatives will restore intestinal immune homeostasis, significantly increasing the fledgling survival rates of urban-nesting birds.</w:t>
       </w:r>
     </w:p>
     <w:p>
@@ -13319,6 +13331,7 @@
           <w:ilvl w:val="0"/>
           <w:numId w:val="2"/>
         </w:numPr>
+        <w:jc w:val="both"/>
         <w:rPr>
           <w:rFonts w:ascii="Times New Roman" w:hAnsi="Times New Roman" w:cs="Times New Roman"/>
         </w:rPr>
@@ -13337,6 +13350,7 @@
           <w:ilvl w:val="0"/>
           <w:numId w:val="2"/>
         </w:numPr>
+        <w:jc w:val="both"/>
         <w:rPr>
           <w:rFonts w:ascii="Times New Roman" w:hAnsi="Times New Roman" w:cs="Times New Roman"/>
         </w:rPr>
@@ -13355,6 +13369,7 @@
           <w:ilvl w:val="0"/>
           <w:numId w:val="2"/>
         </w:numPr>
+        <w:jc w:val="both"/>
         <w:rPr>
           <w:rFonts w:ascii="Times New Roman" w:hAnsi="Times New Roman" w:cs="Times New Roman"/>
         </w:rPr>
@@ -13373,6 +13388,7 @@
           <w:ilvl w:val="0"/>
           <w:numId w:val="2"/>
         </w:numPr>
+        <w:jc w:val="both"/>
         <w:rPr>
           <w:rFonts w:ascii="Times New Roman" w:hAnsi="Times New Roman" w:cs="Times New Roman"/>
         </w:rPr>
@@ -13391,6 +13407,7 @@
           <w:ilvl w:val="0"/>
           <w:numId w:val="2"/>
         </w:numPr>
+        <w:jc w:val="both"/>
         <w:rPr>
           <w:rFonts w:ascii="Times New Roman" w:hAnsi="Times New Roman" w:cs="Times New Roman"/>
         </w:rPr>
@@ -13409,6 +13426,7 @@
           <w:ilvl w:val="0"/>
           <w:numId w:val="2"/>
         </w:numPr>
+        <w:jc w:val="both"/>
         <w:rPr>
           <w:rFonts w:ascii="Times New Roman" w:hAnsi="Times New Roman" w:cs="Times New Roman"/>
         </w:rPr>
@@ -13427,6 +13445,7 @@
           <w:ilvl w:val="0"/>
           <w:numId w:val="2"/>
         </w:numPr>
+        <w:jc w:val="both"/>
         <w:rPr>
           <w:rFonts w:ascii="Times New Roman" w:hAnsi="Times New Roman" w:cs="Times New Roman"/>
         </w:rPr>
@@ -13435,7 +13454,6 @@
         <w:rPr>
           <w:rFonts w:ascii="Times New Roman" w:hAnsi="Times New Roman" w:cs="Times New Roman"/>
         </w:rPr>
-        <w:lastRenderedPageBreak/>
         <w:t xml:space="preserve">If urban insectivorous birds forage on unmanaged vegetation with high </w:t>
       </w:r>
       <w:proofErr w:type="spellStart"/>
@@ -13460,6 +13478,7 @@
           <w:ilvl w:val="0"/>
           <w:numId w:val="2"/>
         </w:numPr>
+        <w:jc w:val="both"/>
         <w:rPr>
           <w:rFonts w:ascii="Times New Roman" w:hAnsi="Times New Roman" w:cs="Times New Roman"/>
         </w:rPr>
@@ -13478,6 +13497,7 @@
           <w:ilvl w:val="0"/>
           <w:numId w:val="2"/>
         </w:numPr>
+        <w:jc w:val="both"/>
         <w:rPr>
           <w:rFonts w:ascii="Times New Roman" w:hAnsi="Times New Roman" w:cs="Times New Roman"/>
         </w:rPr>
@@ -13496,6 +13516,7 @@
           <w:ilvl w:val="0"/>
           <w:numId w:val="2"/>
         </w:numPr>
+        <w:jc w:val="both"/>
         <w:rPr>
           <w:rFonts w:ascii="Times New Roman" w:hAnsi="Times New Roman" w:cs="Times New Roman"/>
         </w:rPr>
@@ -13514,6 +13535,7 @@
           <w:ilvl w:val="0"/>
           <w:numId w:val="2"/>
         </w:numPr>
+        <w:jc w:val="both"/>
         <w:rPr>
           <w:rFonts w:ascii="Times New Roman" w:hAnsi="Times New Roman" w:cs="Times New Roman"/>
         </w:rPr>
@@ -13532,6 +13554,7 @@
           <w:ilvl w:val="0"/>
           <w:numId w:val="2"/>
         </w:numPr>
+        <w:jc w:val="both"/>
         <w:rPr>
           <w:rFonts w:ascii="Times New Roman" w:hAnsi="Times New Roman" w:cs="Times New Roman"/>
         </w:rPr>
@@ -13540,7 +13563,14 @@
         <w:rPr>
           <w:rFonts w:ascii="Times New Roman" w:hAnsi="Times New Roman" w:cs="Times New Roman"/>
         </w:rPr>
-        <w:t>If urban birds incorporate synthetic debris with uncharacteristically high ultraviolet (UV) reflectance into nests, then the resulting UV-spectral mismatch with the natural background will disproportionately increase nest detection and predation by UV-sensitive urban predators.</w:t>
+        <w:t xml:space="preserve">If urban birds incorporate synthetic debris with uncharacteristically high ultraviolet (UV) reflectance into nests, then the resulting UV-spectral mismatch with the natural background </w:t>
+      </w:r>
+      <w:r>
+        <w:rPr>
+          <w:rFonts w:ascii="Times New Roman" w:hAnsi="Times New Roman" w:cs="Times New Roman"/>
+        </w:rPr>
+        <w:lastRenderedPageBreak/>
+        <w:t>will disproportionately increase nest detection and predation by UV-sensitive urban predators.</w:t>
       </w:r>
     </w:p>
     <w:p>
@@ -13550,6 +13580,7 @@
           <w:ilvl w:val="0"/>
           <w:numId w:val="2"/>
         </w:numPr>
+        <w:jc w:val="both"/>
         <w:rPr>
           <w:rFonts w:ascii="Times New Roman" w:hAnsi="Times New Roman" w:cs="Times New Roman"/>
         </w:rPr>
@@ -13568,6 +13599,7 @@
           <w:ilvl w:val="0"/>
           <w:numId w:val="2"/>
         </w:numPr>
+        <w:jc w:val="both"/>
         <w:rPr>
           <w:rFonts w:ascii="Times New Roman" w:hAnsi="Times New Roman" w:cs="Times New Roman"/>
         </w:rPr>
@@ -13586,6 +13618,7 @@
           <w:ilvl w:val="0"/>
           <w:numId w:val="2"/>
         </w:numPr>
+        <w:jc w:val="both"/>
         <w:rPr>
           <w:rFonts w:ascii="Times New Roman" w:hAnsi="Times New Roman" w:cs="Times New Roman"/>
         </w:rPr>
@@ -13604,6 +13637,7 @@
           <w:ilvl w:val="0"/>
           <w:numId w:val="2"/>
         </w:numPr>
+        <w:jc w:val="both"/>
         <w:rPr>
           <w:rFonts w:ascii="Times New Roman" w:hAnsi="Times New Roman" w:cs="Times New Roman"/>
         </w:rPr>
@@ -13622,6 +13656,7 @@
           <w:ilvl w:val="0"/>
           <w:numId w:val="2"/>
         </w:numPr>
+        <w:jc w:val="both"/>
         <w:rPr>
           <w:rFonts w:ascii="Times New Roman" w:hAnsi="Times New Roman" w:cs="Times New Roman"/>
         </w:rPr>
@@ -13630,14 +13665,7 @@
         <w:rPr>
           <w:rFonts w:ascii="Times New Roman" w:hAnsi="Times New Roman" w:cs="Times New Roman"/>
         </w:rPr>
-        <w:t xml:space="preserve">If complex understory restoration is spatially coupled with the suppression of free-roaming cat density, then ground-foraging birds will exhibit a significantly higher </w:t>
-      </w:r>
-      <w:r>
-        <w:rPr>
-          <w:rFonts w:ascii="Times New Roman" w:hAnsi="Times New Roman" w:cs="Times New Roman"/>
-        </w:rPr>
-        <w:lastRenderedPageBreak/>
-        <w:t>ground-to-canopy foraging ratio than in habitats where either factor is addressed in isolation.</w:t>
+        <w:t>If complex understory restoration is spatially coupled with the suppression of free-roaming cat density, then ground-foraging birds will exhibit a significantly higher ground-to-canopy foraging ratio than in habitats where either factor is addressed in isolation.</w:t>
       </w:r>
     </w:p>
     <w:p>
@@ -13647,6 +13675,7 @@
           <w:ilvl w:val="0"/>
           <w:numId w:val="2"/>
         </w:numPr>
+        <w:jc w:val="both"/>
         <w:rPr>
           <w:rFonts w:ascii="Times New Roman" w:hAnsi="Times New Roman" w:cs="Times New Roman"/>
         </w:rPr>
@@ -13665,6 +13694,7 @@
           <w:ilvl w:val="0"/>
           <w:numId w:val="2"/>
         </w:numPr>
+        <w:jc w:val="both"/>
         <w:rPr>
           <w:rFonts w:ascii="Times New Roman" w:hAnsi="Times New Roman" w:cs="Times New Roman"/>
         </w:rPr>
@@ -13683,6 +13713,7 @@
           <w:ilvl w:val="0"/>
           <w:numId w:val="2"/>
         </w:numPr>
+        <w:jc w:val="both"/>
         <w:rPr>
           <w:rFonts w:ascii="Times New Roman" w:hAnsi="Times New Roman" w:cs="Times New Roman"/>
         </w:rPr>
@@ -13701,6 +13732,7 @@
           <w:ilvl w:val="0"/>
           <w:numId w:val="2"/>
         </w:numPr>
+        <w:jc w:val="both"/>
         <w:rPr>
           <w:rFonts w:ascii="Times New Roman" w:hAnsi="Times New Roman" w:cs="Times New Roman"/>
         </w:rPr>
@@ -13733,6 +13765,7 @@
           <w:ilvl w:val="0"/>
           <w:numId w:val="2"/>
         </w:numPr>
+        <w:jc w:val="both"/>
         <w:rPr>
           <w:rFonts w:ascii="Times New Roman" w:hAnsi="Times New Roman" w:cs="Times New Roman"/>
         </w:rPr>
@@ -13751,6 +13784,7 @@
           <w:ilvl w:val="0"/>
           <w:numId w:val="2"/>
         </w:numPr>
+        <w:jc w:val="both"/>
         <w:rPr>
           <w:rFonts w:ascii="Times New Roman" w:hAnsi="Times New Roman" w:cs="Times New Roman"/>
         </w:rPr>
@@ -13769,6 +13803,7 @@
           <w:ilvl w:val="0"/>
           <w:numId w:val="2"/>
         </w:numPr>
+        <w:jc w:val="both"/>
         <w:rPr>
           <w:rFonts w:ascii="Times New Roman" w:hAnsi="Times New Roman" w:cs="Times New Roman"/>
         </w:rPr>
@@ -13787,6 +13822,7 @@
           <w:ilvl w:val="0"/>
           <w:numId w:val="2"/>
         </w:numPr>
+        <w:jc w:val="both"/>
         <w:rPr>
           <w:rFonts w:ascii="Times New Roman" w:hAnsi="Times New Roman" w:cs="Times New Roman"/>
         </w:rPr>
@@ -13795,7 +13831,14 @@
         <w:rPr>
           <w:rFonts w:ascii="Times New Roman" w:hAnsi="Times New Roman" w:cs="Times New Roman"/>
         </w:rPr>
-        <w:t>If high-reward floral hubs are located in high-noise urban environments, then specialized nectarivores will be functionally excluded as acoustic masking increases the energetic cost of physical territory defense.</w:t>
+        <w:t xml:space="preserve">If high-reward floral hubs are located in high-noise urban environments, then specialized nectarivores will be functionally excluded as acoustic masking increases the energetic cost of </w:t>
+      </w:r>
+      <w:r>
+        <w:rPr>
+          <w:rFonts w:ascii="Times New Roman" w:hAnsi="Times New Roman" w:cs="Times New Roman"/>
+        </w:rPr>
+        <w:lastRenderedPageBreak/>
+        <w:t>physical territory defense.</w:t>
       </w:r>
     </w:p>
     <w:p>
@@ -13805,6 +13848,7 @@
           <w:ilvl w:val="0"/>
           <w:numId w:val="2"/>
         </w:numPr>
+        <w:jc w:val="both"/>
         <w:rPr>
           <w:rFonts w:ascii="Times New Roman" w:hAnsi="Times New Roman" w:cs="Times New Roman"/>
         </w:rPr>
@@ -13851,6 +13895,7 @@
           <w:ilvl w:val="0"/>
           <w:numId w:val="2"/>
         </w:numPr>
+        <w:jc w:val="both"/>
         <w:rPr>
           <w:rFonts w:ascii="Times New Roman" w:hAnsi="Times New Roman" w:cs="Times New Roman"/>
         </w:rPr>
@@ -13869,6 +13914,7 @@
           <w:ilvl w:val="0"/>
           <w:numId w:val="2"/>
         </w:numPr>
+        <w:jc w:val="both"/>
         <w:rPr>
           <w:rFonts w:ascii="Times New Roman" w:hAnsi="Times New Roman" w:cs="Times New Roman"/>
         </w:rPr>
@@ -13877,7 +13923,6 @@
         <w:rPr>
           <w:rFonts w:ascii="Times New Roman" w:hAnsi="Times New Roman" w:cs="Times New Roman"/>
         </w:rPr>
-        <w:lastRenderedPageBreak/>
         <w:t>If winter-fruiting vegetation is located immediately adjacent to reflective urban glass facades, then the resulting synchronized mass-collision events among flocking frugivores will drive a severe, localized depletion of frugivorous functional diversity within winter avian assemblages.</w:t>
       </w:r>
     </w:p>
@@ -13888,6 +13933,7 @@
           <w:ilvl w:val="0"/>
           <w:numId w:val="2"/>
         </w:numPr>
+        <w:jc w:val="both"/>
         <w:rPr>
           <w:rFonts w:ascii="Times New Roman" w:hAnsi="Times New Roman" w:cs="Times New Roman"/>
           <w:sz w:val="21"/>
@@ -13903,6 +13949,7 @@
     </w:p>
     <w:p>
       <w:pPr>
+        <w:jc w:val="both"/>
         <w:rPr>
           <w:rFonts w:ascii="Times New Roman" w:eastAsiaTheme="minorEastAsia" w:hAnsi="Times New Roman" w:cs="Times New Roman"/>
           <w:lang w:eastAsia="zh-CN"/>
@@ -13911,6 +13958,7 @@
     </w:p>
     <w:p>
       <w:pPr>
+        <w:jc w:val="both"/>
         <w:rPr>
           <w:rFonts w:ascii="Times New Roman" w:eastAsiaTheme="minorEastAsia" w:hAnsi="Times New Roman" w:cs="Times New Roman"/>
           <w:b/>
@@ -13969,6 +14017,7 @@
                 <w:numId w:val="3"/>
               </w:numPr>
               <w:spacing w:after="0" w:line="240" w:lineRule="auto"/>
+              <w:jc w:val="both"/>
               <w:rPr>
                 <w:rFonts w:ascii="Times New Roman" w:hAnsi="Times New Roman" w:cs="Times New Roman"/>
               </w:rPr>
@@ -14007,6 +14056,7 @@
                 <w:numId w:val="3"/>
               </w:numPr>
               <w:spacing w:after="0" w:line="240" w:lineRule="auto"/>
+              <w:jc w:val="both"/>
               <w:rPr>
                 <w:rFonts w:ascii="Times New Roman" w:hAnsi="Times New Roman" w:cs="Times New Roman"/>
               </w:rPr>
@@ -14059,6 +14109,7 @@
                 <w:numId w:val="3"/>
               </w:numPr>
               <w:spacing w:after="0" w:line="240" w:lineRule="auto"/>
+              <w:jc w:val="both"/>
               <w:rPr>
                 <w:rFonts w:ascii="Times New Roman" w:hAnsi="Times New Roman" w:cs="Times New Roman"/>
               </w:rPr>
@@ -14097,6 +14148,7 @@
                 <w:numId w:val="3"/>
               </w:numPr>
               <w:spacing w:after="0" w:line="240" w:lineRule="auto"/>
+              <w:jc w:val="both"/>
               <w:rPr>
                 <w:rFonts w:ascii="Times New Roman" w:hAnsi="Times New Roman" w:cs="Times New Roman"/>
               </w:rPr>
@@ -14135,6 +14187,7 @@
                 <w:numId w:val="3"/>
               </w:numPr>
               <w:spacing w:after="0" w:line="240" w:lineRule="auto"/>
+              <w:jc w:val="both"/>
               <w:rPr>
                 <w:rFonts w:ascii="Times New Roman" w:hAnsi="Times New Roman" w:cs="Times New Roman"/>
               </w:rPr>
@@ -14173,6 +14226,7 @@
                 <w:numId w:val="3"/>
               </w:numPr>
               <w:spacing w:after="0" w:line="240" w:lineRule="auto"/>
+              <w:jc w:val="both"/>
               <w:rPr>
                 <w:rFonts w:ascii="Times New Roman" w:hAnsi="Times New Roman" w:cs="Times New Roman"/>
               </w:rPr>
@@ -14211,6 +14265,7 @@
                 <w:numId w:val="3"/>
               </w:numPr>
               <w:spacing w:after="0" w:line="240" w:lineRule="auto"/>
+              <w:jc w:val="both"/>
               <w:rPr>
                 <w:rFonts w:ascii="Times New Roman" w:hAnsi="Times New Roman" w:cs="Times New Roman"/>
               </w:rPr>
@@ -14249,6 +14304,7 @@
                 <w:numId w:val="3"/>
               </w:numPr>
               <w:spacing w:after="0" w:line="240" w:lineRule="auto"/>
+              <w:jc w:val="both"/>
               <w:rPr>
                 <w:rFonts w:ascii="Times New Roman" w:hAnsi="Times New Roman" w:cs="Times New Roman"/>
               </w:rPr>
@@ -14287,6 +14343,7 @@
                 <w:numId w:val="3"/>
               </w:numPr>
               <w:spacing w:after="0" w:line="240" w:lineRule="auto"/>
+              <w:jc w:val="both"/>
               <w:rPr>
                 <w:rFonts w:ascii="Times New Roman" w:hAnsi="Times New Roman" w:cs="Times New Roman"/>
               </w:rPr>
@@ -14325,6 +14382,7 @@
                 <w:numId w:val="3"/>
               </w:numPr>
               <w:spacing w:after="0" w:line="240" w:lineRule="auto"/>
+              <w:jc w:val="both"/>
               <w:rPr>
                 <w:rFonts w:ascii="Times New Roman" w:hAnsi="Times New Roman" w:cs="Times New Roman"/>
               </w:rPr>
@@ -14333,7 +14391,14 @@
               <w:rPr>
                 <w:rFonts w:ascii="Times New Roman" w:hAnsi="Times New Roman" w:cs="Times New Roman"/>
               </w:rPr>
-              <w:t>If the size, vegetation structure, adjacent landscape features, and human disturbance levels of small urban greenspaces vary, then corresponding changes will be observed in bird species richness, abundance, and community composition.</w:t>
+              <w:t xml:space="preserve">If the size, vegetation structure, adjacent landscape features, and human disturbance levels </w:t>
+            </w:r>
+            <w:r>
+              <w:rPr>
+                <w:rFonts w:ascii="Times New Roman" w:hAnsi="Times New Roman" w:cs="Times New Roman"/>
+              </w:rPr>
+              <w:lastRenderedPageBreak/>
+              <w:t>of small urban greenspaces vary, then corresponding changes will be observed in bird species richness, abundance, and community composition.</w:t>
             </w:r>
           </w:p>
         </w:tc>
@@ -14363,6 +14428,7 @@
                 <w:numId w:val="3"/>
               </w:numPr>
               <w:spacing w:after="0" w:line="240" w:lineRule="auto"/>
+              <w:jc w:val="both"/>
               <w:rPr>
                 <w:rFonts w:ascii="Times New Roman" w:hAnsi="Times New Roman" w:cs="Times New Roman"/>
               </w:rPr>
@@ -14371,14 +14437,8 @@
               <w:rPr>
                 <w:rFonts w:ascii="Times New Roman" w:hAnsi="Times New Roman" w:cs="Times New Roman"/>
               </w:rPr>
-              <w:t xml:space="preserve">If migratory waterbirds forage and roost in more polluted environments, then their feces will contain a higher abundance of antibiotic resistance genes and a higher proportion of </w:t>
-            </w:r>
-            <w:r>
-              <w:rPr>
-                <w:rFonts w:ascii="Times New Roman" w:hAnsi="Times New Roman" w:cs="Times New Roman"/>
-              </w:rPr>
               <w:lastRenderedPageBreak/>
-              <w:t>potential pathogens compared to species utilizing less polluted habitats.</w:t>
+              <w:t>If migratory waterbirds forage and roost in more polluted environments, then their feces will contain a higher abundance of antibiotic resistance genes and a higher proportion of potential pathogens compared to species utilizing less polluted habitats.</w:t>
             </w:r>
           </w:p>
         </w:tc>
@@ -14408,6 +14468,7 @@
                 <w:numId w:val="3"/>
               </w:numPr>
               <w:spacing w:after="0" w:line="240" w:lineRule="auto"/>
+              <w:jc w:val="both"/>
               <w:rPr>
                 <w:rFonts w:ascii="Times New Roman" w:hAnsi="Times New Roman" w:cs="Times New Roman"/>
               </w:rPr>
@@ -14416,7 +14477,6 @@
               <w:rPr>
                 <w:rFonts w:ascii="Times New Roman" w:hAnsi="Times New Roman" w:cs="Times New Roman"/>
               </w:rPr>
-              <w:lastRenderedPageBreak/>
               <w:t>If the exposure of white storks to human waste disposal sites and cattle grazing increases, then the prevalence of CR E. coli in the storks will increase.</w:t>
             </w:r>
           </w:p>
@@ -14447,6 +14507,7 @@
                 <w:numId w:val="3"/>
               </w:numPr>
               <w:spacing w:after="0" w:line="240" w:lineRule="auto"/>
+              <w:jc w:val="both"/>
               <w:rPr>
                 <w:rFonts w:ascii="Times New Roman" w:hAnsi="Times New Roman" w:cs="Times New Roman"/>
               </w:rPr>
@@ -14485,6 +14546,7 @@
                 <w:numId w:val="3"/>
               </w:numPr>
               <w:spacing w:after="0" w:line="240" w:lineRule="auto"/>
+              <w:jc w:val="both"/>
               <w:rPr>
                 <w:rFonts w:ascii="Times New Roman" w:hAnsi="Times New Roman" w:cs="Times New Roman"/>
               </w:rPr>
@@ -14523,6 +14585,7 @@
                 <w:numId w:val="3"/>
               </w:numPr>
               <w:spacing w:after="0" w:line="240" w:lineRule="auto"/>
+              <w:jc w:val="both"/>
               <w:rPr>
                 <w:rFonts w:ascii="Times New Roman" w:hAnsi="Times New Roman" w:cs="Times New Roman"/>
               </w:rPr>
@@ -14561,6 +14624,7 @@
                 <w:numId w:val="3"/>
               </w:numPr>
               <w:spacing w:after="0" w:line="240" w:lineRule="auto"/>
+              <w:jc w:val="both"/>
               <w:rPr>
                 <w:rFonts w:ascii="Times New Roman" w:hAnsi="Times New Roman" w:cs="Times New Roman"/>
               </w:rPr>
@@ -14599,6 +14663,7 @@
                 <w:numId w:val="3"/>
               </w:numPr>
               <w:spacing w:after="0" w:line="240" w:lineRule="auto"/>
+              <w:jc w:val="both"/>
               <w:rPr>
                 <w:rFonts w:ascii="Times New Roman" w:hAnsi="Times New Roman" w:cs="Times New Roman"/>
               </w:rPr>
@@ -14637,6 +14702,7 @@
                 <w:numId w:val="3"/>
               </w:numPr>
               <w:spacing w:after="0" w:line="240" w:lineRule="auto"/>
+              <w:jc w:val="both"/>
               <w:rPr>
                 <w:rFonts w:ascii="Times New Roman" w:hAnsi="Times New Roman" w:cs="Times New Roman"/>
               </w:rPr>
@@ -14675,6 +14741,7 @@
                 <w:numId w:val="3"/>
               </w:numPr>
               <w:spacing w:after="0" w:line="240" w:lineRule="auto"/>
+              <w:jc w:val="both"/>
               <w:rPr>
                 <w:rFonts w:ascii="Times New Roman" w:hAnsi="Times New Roman" w:cs="Times New Roman"/>
               </w:rPr>
@@ -14713,6 +14780,7 @@
                 <w:numId w:val="3"/>
               </w:numPr>
               <w:spacing w:after="0" w:line="240" w:lineRule="auto"/>
+              <w:jc w:val="both"/>
               <w:rPr>
                 <w:rFonts w:ascii="Times New Roman" w:hAnsi="Times New Roman" w:cs="Times New Roman"/>
               </w:rPr>
@@ -14751,6 +14819,7 @@
                 <w:numId w:val="3"/>
               </w:numPr>
               <w:spacing w:after="0" w:line="240" w:lineRule="auto"/>
+              <w:jc w:val="both"/>
               <w:rPr>
                 <w:rFonts w:ascii="Times New Roman" w:hAnsi="Times New Roman" w:cs="Times New Roman"/>
               </w:rPr>
@@ -14789,6 +14858,7 @@
                 <w:numId w:val="3"/>
               </w:numPr>
               <w:spacing w:after="0" w:line="240" w:lineRule="auto"/>
+              <w:jc w:val="both"/>
               <w:rPr>
                 <w:rFonts w:ascii="Times New Roman" w:hAnsi="Times New Roman" w:cs="Times New Roman"/>
               </w:rPr>
@@ -14827,6 +14897,7 @@
                 <w:numId w:val="3"/>
               </w:numPr>
               <w:spacing w:after="0" w:line="240" w:lineRule="auto"/>
+              <w:jc w:val="both"/>
               <w:rPr>
                 <w:rFonts w:ascii="Times New Roman" w:hAnsi="Times New Roman" w:cs="Times New Roman"/>
               </w:rPr>
@@ -14865,6 +14936,7 @@
                 <w:numId w:val="3"/>
               </w:numPr>
               <w:spacing w:after="0" w:line="240" w:lineRule="auto"/>
+              <w:jc w:val="both"/>
               <w:rPr>
                 <w:rFonts w:ascii="Times New Roman" w:hAnsi="Times New Roman" w:cs="Times New Roman"/>
               </w:rPr>
@@ -14903,6 +14975,7 @@
                 <w:numId w:val="3"/>
               </w:numPr>
               <w:spacing w:after="0" w:line="240" w:lineRule="auto"/>
+              <w:jc w:val="both"/>
               <w:rPr>
                 <w:rFonts w:ascii="Times New Roman" w:hAnsi="Times New Roman" w:cs="Times New Roman"/>
               </w:rPr>
@@ -14941,6 +15014,7 @@
                 <w:numId w:val="3"/>
               </w:numPr>
               <w:spacing w:after="0" w:line="240" w:lineRule="auto"/>
+              <w:jc w:val="both"/>
               <w:rPr>
                 <w:rFonts w:ascii="Times New Roman" w:hAnsi="Times New Roman" w:cs="Times New Roman"/>
               </w:rPr>
@@ -14949,14 +15023,7 @@
               <w:rPr>
                 <w:rFonts w:ascii="Times New Roman" w:hAnsi="Times New Roman" w:cs="Times New Roman"/>
               </w:rPr>
-              <w:t xml:space="preserve">If urbanization increases habitat loss and fragmentation by reducing wetland percent cover and patch size, then bird biodiversity will decrease as urban-avoiding species are replaced </w:t>
-            </w:r>
-            <w:r>
-              <w:rPr>
-                <w:rFonts w:ascii="Times New Roman" w:hAnsi="Times New Roman" w:cs="Times New Roman"/>
-              </w:rPr>
-              <w:lastRenderedPageBreak/>
-              <w:t>by urban-adapted species.</w:t>
+              <w:t>If urbanization increases habitat loss and fragmentation by reducing wetland percent cover and patch size, then bird biodiversity will decrease as urban-avoiding species are replaced by urban-adapted species.</w:t>
             </w:r>
           </w:p>
         </w:tc>
@@ -14986,6 +15053,7 @@
                 <w:numId w:val="3"/>
               </w:numPr>
               <w:spacing w:after="0" w:line="240" w:lineRule="auto"/>
+              <w:jc w:val="both"/>
               <w:rPr>
                 <w:rFonts w:ascii="Times New Roman" w:hAnsi="Times New Roman" w:cs="Times New Roman"/>
               </w:rPr>
@@ -14994,8 +15062,14 @@
               <w:rPr>
                 <w:rFonts w:ascii="Times New Roman" w:hAnsi="Times New Roman" w:cs="Times New Roman"/>
               </w:rPr>
+              <w:t xml:space="preserve">If changes are made to patch size, human disturbance, vegetation complexity, and connectivity in urban forest patches, then corresponding changes will be observed in bird </w:t>
+            </w:r>
+            <w:r>
+              <w:rPr>
+                <w:rFonts w:ascii="Times New Roman" w:hAnsi="Times New Roman" w:cs="Times New Roman"/>
+              </w:rPr>
               <w:lastRenderedPageBreak/>
-              <w:t>If changes are made to patch size, human disturbance, vegetation complexity, and connectivity in urban forest patches, then corresponding changes will be observed in bird species diversity, with patch size and human disturbance exerting the greatest influence.</w:t>
+              <w:t>species diversity, with patch size and human disturbance exerting the greatest influence.</w:t>
             </w:r>
           </w:p>
         </w:tc>
@@ -15025,6 +15099,7 @@
                 <w:numId w:val="3"/>
               </w:numPr>
               <w:spacing w:after="0" w:line="240" w:lineRule="auto"/>
+              <w:jc w:val="both"/>
               <w:rPr>
                 <w:rFonts w:ascii="Times New Roman" w:hAnsi="Times New Roman" w:cs="Times New Roman"/>
               </w:rPr>
@@ -15033,6 +15108,7 @@
               <w:rPr>
                 <w:rFonts w:ascii="Times New Roman" w:hAnsi="Times New Roman" w:cs="Times New Roman"/>
               </w:rPr>
+              <w:lastRenderedPageBreak/>
               <w:t>If restoration actions in fragmented landscapes specifically target the reproduction, survivorship, and dispersal of individual animals, then the successful recovery and maintenance of diverse wildlife community compositions will significantly increase.</w:t>
             </w:r>
           </w:p>
@@ -15063,6 +15139,7 @@
                 <w:numId w:val="3"/>
               </w:numPr>
               <w:spacing w:after="0" w:line="240" w:lineRule="auto"/>
+              <w:jc w:val="both"/>
               <w:rPr>
                 <w:rFonts w:ascii="Times New Roman" w:hAnsi="Times New Roman" w:cs="Times New Roman"/>
               </w:rPr>
@@ -15101,6 +15178,7 @@
                 <w:numId w:val="3"/>
               </w:numPr>
               <w:spacing w:after="0" w:line="240" w:lineRule="auto"/>
+              <w:jc w:val="both"/>
               <w:rPr>
                 <w:rFonts w:ascii="Times New Roman" w:hAnsi="Times New Roman" w:cs="Times New Roman"/>
               </w:rPr>
@@ -15139,6 +15217,7 @@
                 <w:numId w:val="3"/>
               </w:numPr>
               <w:spacing w:after="0" w:line="240" w:lineRule="auto"/>
+              <w:jc w:val="both"/>
               <w:rPr>
                 <w:rFonts w:ascii="Times New Roman" w:hAnsi="Times New Roman" w:cs="Times New Roman"/>
               </w:rPr>
@@ -15177,6 +15256,7 @@
                 <w:numId w:val="3"/>
               </w:numPr>
               <w:spacing w:after="0" w:line="240" w:lineRule="auto"/>
+              <w:jc w:val="both"/>
               <w:rPr>
                 <w:rFonts w:ascii="Times New Roman" w:hAnsi="Times New Roman" w:cs="Times New Roman"/>
               </w:rPr>
@@ -15215,6 +15295,7 @@
                 <w:numId w:val="3"/>
               </w:numPr>
               <w:spacing w:after="0" w:line="240" w:lineRule="auto"/>
+              <w:jc w:val="both"/>
               <w:rPr>
                 <w:rFonts w:ascii="Times New Roman" w:hAnsi="Times New Roman" w:cs="Times New Roman"/>
               </w:rPr>
@@ -15267,6 +15348,7 @@
                 <w:numId w:val="3"/>
               </w:numPr>
               <w:spacing w:after="0" w:line="240" w:lineRule="auto"/>
+              <w:jc w:val="both"/>
               <w:rPr>
                 <w:rFonts w:ascii="Times New Roman" w:hAnsi="Times New Roman" w:cs="Times New Roman"/>
               </w:rPr>
@@ -15319,6 +15401,7 @@
                 <w:numId w:val="3"/>
               </w:numPr>
               <w:spacing w:after="0" w:line="240" w:lineRule="auto"/>
+              <w:jc w:val="both"/>
               <w:rPr>
                 <w:rFonts w:ascii="Times New Roman" w:hAnsi="Times New Roman" w:cs="Times New Roman"/>
               </w:rPr>
@@ -15357,6 +15440,7 @@
                 <w:numId w:val="3"/>
               </w:numPr>
               <w:spacing w:after="0" w:line="240" w:lineRule="auto"/>
+              <w:jc w:val="both"/>
               <w:rPr>
                 <w:rFonts w:ascii="Times New Roman" w:hAnsi="Times New Roman" w:cs="Times New Roman"/>
               </w:rPr>
@@ -15395,6 +15479,7 @@
                 <w:numId w:val="3"/>
               </w:numPr>
               <w:spacing w:after="0" w:line="240" w:lineRule="auto"/>
+              <w:jc w:val="both"/>
               <w:rPr>
                 <w:rFonts w:ascii="Times New Roman" w:hAnsi="Times New Roman" w:cs="Times New Roman"/>
               </w:rPr>
@@ -15433,6 +15518,7 @@
                 <w:numId w:val="3"/>
               </w:numPr>
               <w:spacing w:after="0" w:line="240" w:lineRule="auto"/>
+              <w:jc w:val="both"/>
               <w:rPr>
                 <w:rFonts w:ascii="Times New Roman" w:hAnsi="Times New Roman" w:cs="Times New Roman"/>
               </w:rPr>
@@ -15485,6 +15571,7 @@
                 <w:numId w:val="3"/>
               </w:numPr>
               <w:spacing w:after="0" w:line="240" w:lineRule="auto"/>
+              <w:jc w:val="both"/>
               <w:rPr>
                 <w:rFonts w:ascii="Times New Roman" w:hAnsi="Times New Roman" w:cs="Times New Roman"/>
               </w:rPr>
@@ -15523,6 +15610,7 @@
                 <w:numId w:val="3"/>
               </w:numPr>
               <w:spacing w:after="0" w:line="240" w:lineRule="auto"/>
+              <w:jc w:val="both"/>
               <w:rPr>
                 <w:rFonts w:ascii="Times New Roman" w:hAnsi="Times New Roman" w:cs="Times New Roman"/>
               </w:rPr>
@@ -15561,6 +15649,7 @@
                 <w:numId w:val="3"/>
               </w:numPr>
               <w:spacing w:after="0" w:line="240" w:lineRule="auto"/>
+              <w:jc w:val="both"/>
               <w:rPr>
                 <w:rFonts w:ascii="Times New Roman" w:hAnsi="Times New Roman" w:cs="Times New Roman"/>
               </w:rPr>
@@ -15569,14 +15658,7 @@
               <w:rPr>
                 <w:rFonts w:ascii="Times New Roman" w:hAnsi="Times New Roman" w:cs="Times New Roman"/>
               </w:rPr>
-              <w:t xml:space="preserve">If community-driven greening projects increase green space patch size and tree planting, then bird species richness and avian diversity will increase relative to nearby non-greened </w:t>
-            </w:r>
-            <w:r>
-              <w:rPr>
-                <w:rFonts w:ascii="Times New Roman" w:hAnsi="Times New Roman" w:cs="Times New Roman"/>
-              </w:rPr>
-              <w:lastRenderedPageBreak/>
-              <w:t>urban areas.</w:t>
+              <w:t>If community-driven greening projects increase green space patch size and tree planting, then bird species richness and avian diversity will increase relative to nearby non-greened urban areas.</w:t>
             </w:r>
           </w:p>
         </w:tc>
@@ -15606,6 +15688,7 @@
                 <w:numId w:val="3"/>
               </w:numPr>
               <w:spacing w:after="0" w:line="240" w:lineRule="auto"/>
+              <w:jc w:val="both"/>
               <w:rPr>
                 <w:rFonts w:ascii="Times New Roman" w:hAnsi="Times New Roman" w:cs="Times New Roman"/>
               </w:rPr>
@@ -15614,7 +15697,6 @@
               <w:rPr>
                 <w:rFonts w:ascii="Times New Roman" w:hAnsi="Times New Roman" w:cs="Times New Roman"/>
               </w:rPr>
-              <w:lastRenderedPageBreak/>
               <w:t xml:space="preserve">If bird observation data are integrated with a multi-method framework combining </w:t>
             </w:r>
             <w:proofErr w:type="spellStart"/>
@@ -15659,6 +15741,7 @@
                 <w:numId w:val="3"/>
               </w:numPr>
               <w:spacing w:after="0" w:line="240" w:lineRule="auto"/>
+              <w:jc w:val="both"/>
               <w:rPr>
                 <w:rFonts w:ascii="Times New Roman" w:hAnsi="Times New Roman" w:cs="Times New Roman"/>
               </w:rPr>
@@ -15697,6 +15780,7 @@
                 <w:numId w:val="3"/>
               </w:numPr>
               <w:spacing w:after="0" w:line="240" w:lineRule="auto"/>
+              <w:jc w:val="both"/>
               <w:rPr>
                 <w:rFonts w:ascii="Times New Roman" w:hAnsi="Times New Roman" w:cs="Times New Roman"/>
               </w:rPr>
@@ -15735,6 +15819,7 @@
                 <w:numId w:val="3"/>
               </w:numPr>
               <w:spacing w:after="0" w:line="240" w:lineRule="auto"/>
+              <w:jc w:val="both"/>
               <w:rPr>
                 <w:rFonts w:ascii="Times New Roman" w:hAnsi="Times New Roman" w:cs="Times New Roman"/>
               </w:rPr>
@@ -15743,12 +15828,283 @@
               <w:rPr>
                 <w:rFonts w:ascii="Times New Roman" w:hAnsi="Times New Roman" w:cs="Times New Roman"/>
               </w:rPr>
+              <w:lastRenderedPageBreak/>
               <w:t>If park area, habitat diversity, and distance to the city center are increased, and park isolation, park shape, and environmental noise are decreased, then an increase in bird species richness will be observed.</w:t>
             </w:r>
           </w:p>
         </w:tc>
       </w:tr>
     </w:tbl>
+    <w:p>
+      <w:pPr>
+        <w:rPr>
+          <w:rFonts w:ascii="Times New Roman" w:eastAsiaTheme="minorEastAsia" w:hAnsi="Times New Roman" w:cs="Times New Roman"/>
+          <w:lang w:eastAsia="zh-CN"/>
+        </w:rPr>
+      </w:pPr>
+    </w:p>
+    <w:p>
+      <w:pPr>
+        <w:rPr>
+          <w:rFonts w:ascii="Times New Roman" w:eastAsiaTheme="minorEastAsia" w:hAnsi="Times New Roman" w:cs="Times New Roman"/>
+          <w:lang w:eastAsia="zh-CN"/>
+        </w:rPr>
+      </w:pPr>
+    </w:p>
+    <w:p>
+      <w:pPr>
+        <w:rPr>
+          <w:rFonts w:ascii="Times New Roman" w:eastAsiaTheme="minorEastAsia" w:hAnsi="Times New Roman" w:cs="Times New Roman"/>
+          <w:lang w:eastAsia="zh-CN"/>
+        </w:rPr>
+      </w:pPr>
+    </w:p>
+    <w:p>
+      <w:pPr>
+        <w:pStyle w:val="1"/>
+        <w:rPr>
+          <w:rFonts w:ascii="Times New Roman" w:eastAsia="Arial" w:hAnsi="Times New Roman" w:cs="Times New Roman"/>
+          <w:b/>
+          <w:color w:val="000000" w:themeColor="text1"/>
+          <w:sz w:val="24"/>
+          <w:szCs w:val="24"/>
+        </w:rPr>
+      </w:pPr>
+      <w:r>
+        <w:rPr>
+          <w:rFonts w:ascii="Times New Roman" w:eastAsia="Arial" w:hAnsi="Times New Roman" w:cs="Times New Roman"/>
+          <w:b/>
+          <w:color w:val="000000" w:themeColor="text1"/>
+          <w:sz w:val="24"/>
+          <w:szCs w:val="24"/>
+        </w:rPr>
+        <w:t xml:space="preserve">Supplementary Note </w:t>
+      </w:r>
+      <w:r>
+        <w:rPr>
+          <w:rFonts w:ascii="Times New Roman" w:eastAsiaTheme="minorEastAsia" w:hAnsi="Times New Roman" w:cs="Times New Roman" w:hint="eastAsia"/>
+          <w:b/>
+          <w:color w:val="000000" w:themeColor="text1"/>
+          <w:sz w:val="24"/>
+          <w:szCs w:val="24"/>
+        </w:rPr>
+        <w:t>4</w:t>
+      </w:r>
+      <w:r>
+        <w:rPr>
+          <w:rFonts w:ascii="Times New Roman" w:eastAsia="Arial" w:hAnsi="Times New Roman" w:cs="Times New Roman"/>
+          <w:b/>
+          <w:color w:val="000000" w:themeColor="text1"/>
+          <w:sz w:val="24"/>
+          <w:szCs w:val="24"/>
+        </w:rPr>
+        <w:t xml:space="preserve"> | Construction and validation of the pairwise comparison design</w:t>
+      </w:r>
+    </w:p>
+    <w:p>
+      <w:pPr>
+        <w:ind w:firstLine="420"/>
+        <w:jc w:val="both"/>
+        <w:rPr>
+          <w:rFonts w:ascii="Times New Roman" w:eastAsiaTheme="minorEastAsia" w:hAnsi="Times New Roman" w:cs="Times New Roman" w:hint="eastAsia"/>
+          <w:lang w:eastAsia="zh-CN"/>
+        </w:rPr>
+      </w:pPr>
+      <w:r>
+        <w:rPr>
+          <w:rFonts w:ascii="Times New Roman" w:eastAsiaTheme="minorEastAsia" w:hAnsi="Times New Roman" w:cs="Times New Roman"/>
+          <w:lang w:eastAsia="zh-CN"/>
+        </w:rPr>
+        <w:t>The comparison design included 90 hypotheses, comprising 45 LLM-generated hypotheses and 45 human-proposed hypotheses. Thirty experts were each assigned 45 distinct hypotheses and evaluated 45 pairs. Predefined expert–hypothesis exclusions were applied to ensure that experts were not assigned human-proposed hypotheses derived from papers to which they had contributed.</w:t>
+      </w:r>
+    </w:p>
+    <w:p>
+      <w:pPr>
+        <w:ind w:firstLine="420"/>
+        <w:jc w:val="both"/>
+        <w:rPr>
+          <w:rFonts w:ascii="Times New Roman" w:eastAsiaTheme="minorEastAsia" w:hAnsi="Times New Roman" w:cs="Times New Roman" w:hint="eastAsia"/>
+          <w:lang w:eastAsia="zh-CN"/>
+        </w:rPr>
+      </w:pPr>
+      <w:r>
+        <w:rPr>
+          <w:rFonts w:ascii="Times New Roman" w:eastAsiaTheme="minorEastAsia" w:hAnsi="Times New Roman" w:cs="Times New Roman"/>
+          <w:lang w:eastAsia="zh-CN"/>
+        </w:rPr>
+        <w:t>Hypotheses were assigned using a quota-balanced weighted sampling procedure. Fifteen experts received 23 human-proposed and 22 LLM-generated hypotheses, whereas the remaining 15 received 22 human-proposed and 23 LLM-generated hypotheses. During assignment, hypotheses with more remaining allocation slots received higher sampling weights. Sampling was repeated until every hypothesis had been assigned to exactly 15 experts and all expert-specific exclusions had been satisfied.</w:t>
+      </w:r>
+    </w:p>
+    <w:p>
+      <w:pPr>
+        <w:ind w:firstLine="420"/>
+        <w:jc w:val="both"/>
+        <w:rPr>
+          <w:rFonts w:ascii="Times New Roman" w:eastAsiaTheme="minorEastAsia" w:hAnsi="Times New Roman" w:cs="Times New Roman" w:hint="eastAsia"/>
+          <w:lang w:eastAsia="zh-CN"/>
+        </w:rPr>
+      </w:pPr>
+      <w:r>
+        <w:rPr>
+          <w:rFonts w:ascii="Times New Roman" w:eastAsiaTheme="minorEastAsia" w:hAnsi="Times New Roman" w:cs="Times New Roman"/>
+          <w:lang w:eastAsia="zh-CN"/>
+        </w:rPr>
+        <w:t>For each expert, the 45 assigned hypotheses were arranged into a circular chain. This produced 45 comparisons from 45 hypotheses and ensured that each hypothesis appeared exactly twice for that expert. Each expert received 9 within-source comparisons and 36 cross-source comparisons. Pair order was randomized before questionnaire administration.</w:t>
+      </w:r>
+    </w:p>
+    <w:p>
+      <w:pPr>
+        <w:ind w:firstLine="420"/>
+        <w:jc w:val="both"/>
+        <w:rPr>
+          <w:rFonts w:ascii="Times New Roman" w:eastAsiaTheme="minorEastAsia" w:hAnsi="Times New Roman" w:cs="Times New Roman"/>
+          <w:lang w:eastAsia="zh-CN"/>
+        </w:rPr>
+      </w:pPr>
+      <w:r>
+        <w:rPr>
+          <w:rFonts w:ascii="Times New Roman" w:eastAsiaTheme="minorEastAsia" w:hAnsi="Times New Roman" w:cs="Times New Roman"/>
+          <w:lang w:eastAsia="zh-CN"/>
+        </w:rPr>
+        <w:t>Across all 30 experts, the procedure generated 1,350 pairwise comparisons. Of these, 1,080 were cross-source comparisons and 270 were within-source comparisons, corresponding to the prespecified proportions of 80% and 20%, respectively. The within-source comparisons were evenly divided between 135 LLM–LLM pairs and 135 human–human pairs. No expert-specific exclusion was violated.</w:t>
+      </w:r>
+      <w:r>
+        <w:rPr>
+          <w:rFonts w:ascii="Times New Roman" w:eastAsiaTheme="minorEastAsia" w:hAnsi="Times New Roman" w:cs="Times New Roman" w:hint="eastAsia"/>
+          <w:lang w:eastAsia="zh-CN"/>
+        </w:rPr>
+        <w:t xml:space="preserve"> </w:t>
+      </w:r>
+      <w:r>
+        <w:rPr>
+          <w:rFonts w:ascii="Times New Roman" w:eastAsiaTheme="minorEastAsia" w:hAnsi="Times New Roman" w:cs="Times New Roman"/>
+          <w:lang w:eastAsia="zh-CN"/>
+        </w:rPr>
+        <w:t>Network connectivity was assessed by representing the design as an undirected comparison graph in which the 90 hypotheses were nodes and pairwise comparisons were edges. Repeated comparisons were retained as edge multiplicities. The graph contained a single connected component, and every hypothesis had a weighted degree of 30. The second-smallest eigenvalue of the unnormalized graph Laplacian, also known as the algebraic connectivity or Fiedler value, was:</w:t>
+      </w:r>
+    </w:p>
+    <w:p>
+      <w:pPr>
+        <w:jc w:val="both"/>
+        <w:rPr>
+          <w:rFonts w:ascii="Times New Roman" w:eastAsiaTheme="minorEastAsia" w:hAnsi="Times New Roman" w:cs="Times New Roman"/>
+          <w:lang w:eastAsia="zh-CN"/>
+        </w:rPr>
+      </w:pPr>
+      <m:oMathPara>
+        <m:oMath>
+          <m:sSub>
+            <m:sSubPr>
+              <m:ctrlPr>
+                <w:rPr>
+                  <w:rFonts w:ascii="Cambria Math" w:eastAsiaTheme="minorEastAsia" w:hAnsi="Cambria Math" w:cs="Times New Roman"/>
+                  <w:lang w:eastAsia="zh-CN"/>
+                </w:rPr>
+              </m:ctrlPr>
+            </m:sSubPr>
+            <m:e>
+              <m:r>
+                <w:rPr>
+                  <w:rFonts w:ascii="Cambria Math" w:eastAsiaTheme="minorEastAsia" w:hAnsi="Cambria Math" w:cs="Times New Roman"/>
+                  <w:lang w:eastAsia="zh-CN"/>
+                </w:rPr>
+                <m:t>λ</m:t>
+              </m:r>
+            </m:e>
+            <m:sub>
+              <m:r>
+                <w:rPr>
+                  <w:rFonts w:ascii="Cambria Math" w:eastAsiaTheme="minorEastAsia" w:hAnsi="Cambria Math" w:cs="Times New Roman"/>
+                  <w:lang w:eastAsia="zh-CN"/>
+                </w:rPr>
+                <m:t>2</m:t>
+              </m:r>
+            </m:sub>
+          </m:sSub>
+          <m:r>
+            <w:rPr>
+              <w:rFonts w:ascii="Cambria Math" w:eastAsiaTheme="minorEastAsia" w:hAnsi="Cambria Math" w:cs="Times New Roman"/>
+              <w:lang w:eastAsia="zh-CN"/>
+            </w:rPr>
+            <m:t>=19.6588.</m:t>
+          </m:r>
+        </m:oMath>
+      </m:oMathPara>
+    </w:p>
+    <w:p>
+      <w:pPr>
+        <w:jc w:val="both"/>
+        <w:rPr>
+          <w:rFonts w:ascii="Times New Roman" w:eastAsiaTheme="minorEastAsia" w:hAnsi="Times New Roman" w:cs="Times New Roman"/>
+          <w:lang w:eastAsia="zh-CN"/>
+        </w:rPr>
+      </w:pPr>
+      <w:r>
+        <w:rPr>
+          <w:rFonts w:ascii="Times New Roman" w:eastAsiaTheme="minorEastAsia" w:hAnsi="Times New Roman" w:cs="Times New Roman"/>
+          <w:lang w:eastAsia="zh-CN"/>
+        </w:rPr>
+        <w:t xml:space="preserve">Because </w:t>
+      </w:r>
+      <m:oMath>
+        <m:sSub>
+          <m:sSubPr>
+            <m:ctrlPr>
+              <w:rPr>
+                <w:rFonts w:ascii="Cambria Math" w:eastAsiaTheme="minorEastAsia" w:hAnsi="Cambria Math" w:cs="Times New Roman"/>
+                <w:lang w:eastAsia="zh-CN"/>
+              </w:rPr>
+            </m:ctrlPr>
+          </m:sSubPr>
+          <m:e>
+            <m:r>
+              <w:rPr>
+                <w:rFonts w:ascii="Cambria Math" w:eastAsiaTheme="minorEastAsia" w:hAnsi="Cambria Math" w:cs="Times New Roman"/>
+                <w:lang w:eastAsia="zh-CN"/>
+              </w:rPr>
+              <m:t>λ</m:t>
+            </m:r>
+          </m:e>
+          <m:sub>
+            <m:r>
+              <w:rPr>
+                <w:rFonts w:ascii="Cambria Math" w:eastAsiaTheme="minorEastAsia" w:hAnsi="Cambria Math" w:cs="Times New Roman"/>
+                <w:lang w:eastAsia="zh-CN"/>
+              </w:rPr>
+              <m:t>2</m:t>
+            </m:r>
+          </m:sub>
+        </m:sSub>
+        <m:r>
+          <w:rPr>
+            <w:rFonts w:ascii="Cambria Math" w:eastAsiaTheme="minorEastAsia" w:hAnsi="Cambria Math" w:cs="Times New Roman"/>
+            <w:lang w:eastAsia="zh-CN"/>
+          </w:rPr>
+          <m:t>&gt;0</m:t>
+        </m:r>
+      </m:oMath>
+      <w:r>
+        <w:rPr>
+          <w:rFonts w:ascii="Times New Roman" w:eastAsiaTheme="minorEastAsia" w:hAnsi="Times New Roman" w:cs="Times New Roman"/>
+          <w:lang w:eastAsia="zh-CN"/>
+        </w:rPr>
+        <w:t>, the comparison graph was connected, allowing all hypotheses to be linked through direct or indirect comparison paths. All prespecified checks were satisfied, including balanced hypothesis exposure, the required comparison-type proportions,</w:t>
+      </w:r>
+      <w:r>
+        <w:rPr>
+          <w:rFonts w:ascii="Times New Roman" w:eastAsiaTheme="minorEastAsia" w:hAnsi="Times New Roman" w:cs="Times New Roman" w:hint="eastAsia"/>
+          <w:lang w:eastAsia="zh-CN"/>
+        </w:rPr>
+        <w:t xml:space="preserve"> </w:t>
+      </w:r>
+      <w:r>
+        <w:rPr>
+          <w:rFonts w:ascii="Times New Roman" w:eastAsiaTheme="minorEastAsia" w:hAnsi="Times New Roman" w:cs="Times New Roman"/>
+          <w:lang w:eastAsia="zh-CN"/>
+        </w:rPr>
+        <w:t xml:space="preserve">compliance with expert-specific exclusions, and full graph connectivity. </w:t>
+      </w:r>
+    </w:p>
     <w:p>
       <w:pPr>
         <w:rPr>

</xml_diff>